<commit_message>
fixed supplemental tables, removing nest
</commit_message>
<xml_diff>
--- a/output/tables/reanalysis_tables.docx
+++ b/output/tables/reanalysis_tables.docx
@@ -12101,1788 +12101,6 @@
           <w:szCs w:val="22"/>
           <w:color w:val="000000"/>
         </w:rPr>
-        <w:t xml:space="preserve">. Effect of best management practices on nest success by grassland </w:t>
-      </w:r>
-      <w:r>
-        <w:rPr>
-          <w:rFonts w:ascii="Times New Roman" w:hAnsi="Times New Roman" w:eastAsia="Times New Roman" w:cs="Times New Roman"/>
-          <w:i w:val="false"/>
-          <w:b w:val="false"/>
-          <w:u w:val="none"/>
-          <w:strike w:val="false"/>
-          <w:sz w:val="22"/>
-          <w:szCs w:val="22"/>
-          <w:color w:val="000000"/>
-        </w:rPr>
-        <w:t xml:space="preserve">guild. Effect sizes are reported as log hazard ratios. Positive </w:t>
-      </w:r>
-      <w:r>
-        <w:rPr>
-          <w:rFonts w:ascii="Times New Roman" w:hAnsi="Times New Roman" w:eastAsia="Times New Roman" w:cs="Times New Roman"/>
-          <w:i w:val="false"/>
-          <w:b w:val="false"/>
-          <w:u w:val="none"/>
-          <w:strike w:val="false"/>
-          <w:sz w:val="22"/>
-          <w:szCs w:val="22"/>
-          <w:color w:val="000000"/>
-        </w:rPr>
-        <w:t xml:space="preserve">values indicate a better conservation outcome under the practice. </w:t>
-      </w:r>
-      <w:r>
-        <w:rPr>
-          <w:rFonts w:ascii="Times New Roman" w:hAnsi="Times New Roman" w:eastAsia="Times New Roman" w:cs="Times New Roman"/>
-          <w:i w:val="false"/>
-          <w:b w:val="false"/>
-          <w:u w:val="none"/>
-          <w:strike w:val="false"/>
-          <w:sz w:val="22"/>
-          <w:szCs w:val="22"/>
-          <w:color w:val="000000"/>
-        </w:rPr>
-        <w:t xml:space="preserve">Bold indicates a 95% credible interval that excludes zero. </w:t>
-      </w:r>
-    </w:p>
-    <w:tbl xmlns:a="http://schemas.openxmlformats.org/drawingml/2006/main" xmlns:pic="http://schemas.openxmlformats.org/drawingml/2006/picture">
-      <w:tblPr>
-        <w:tblLayout w:type="autofit"/>
-        <w:jc w:val="center"/>
-        <w:tblW w:type="pct" w:w="0"/>
-        <w:tblLook w:firstRow="1" w:lastRow="0" w:firstColumn="0" w:lastColumn="0" w:noHBand="0" w:noVBand="1"/>
-      </w:tblPr>
-      <w:tr>
-        <w:trPr>
-          <w:cantSplit/>
-          <w:trHeight w:val="638" w:hRule="auto"/>
-          <w:tblHeader/>
-        </w:trPr>
-        <w:tc>
-          <w:tcPr>
-            <w:tcBorders>
-              <w:bottom w:val="single" w:sz="12" w:space="0" w:color="666666"/>
-              <w:top w:val="single" w:sz="12" w:space="0" w:color="666666"/>
-              <w:left w:val="none" w:sz="0" w:space="0" w:color="000000"/>
-              <w:right w:val="none" w:sz="0" w:space="0" w:color="000000"/>
-            </w:tcBorders>
-            <w:shd w:val="clear" w:color="auto" w:fill="FFFFFF"/>
-            <w:tcMar>
-              <w:top w:w="0" w:type="dxa"/>
-              <w:bottom w:w="0" w:type="dxa"/>
-              <w:left w:w="0" w:type="dxa"/>
-              <w:right w:w="0" w:type="dxa"/>
-            </w:tcMar>
-            <w:vAlign w:val="center"/>
-          </w:tcPr>
-          <w:p>
-            <w:pPr>
-              <w:pStyle w:val="Normal"/>
-              <w:jc w:val="center"/>
-              <w:keepNext/>
-              <w:pBdr>
-                <w:bottom w:val="none" w:sz="0" w:space="0" w:color="000000"/>
-                <w:top w:val="none" w:sz="0" w:space="0" w:color="000000"/>
-                <w:left w:val="none" w:sz="0" w:space="0" w:color="000000"/>
-                <w:right w:val="none" w:sz="0" w:space="0" w:color="000000"/>
-              </w:pBdr>
-              <w:spacing w:after="40" w:before="40" w:line="240"/>
-              <w:ind w:left="100" w:right="100" w:firstLine="0" w:firstLineChars="0"/>
-              <w:rPr>
-                <w:rFonts w:ascii="Times New Roman" w:hAnsi="Helvetica" w:eastAsia="Helvetica" w:cs="Helvetica"/>
-                <w:i w:val="false"/>
-                <w:b w:val="false"/>
-                <w:u w:val="none"/>
-                <w:strike w:val="false"/>
-                <w:sz w:val="22"/>
-                <w:szCs w:val="22"/>
-                <w:color w:val="000000"/>
-              </w:rPr>
-            </w:pPr>
-            <w:r>
-              <w:rPr>
-                <w:rFonts w:ascii="Times New Roman" w:hAnsi="Helvetica" w:eastAsia="Helvetica" w:cs="Helvetica"/>
-                <w:i w:val="false"/>
-                <w:b w:val="false"/>
-                <w:u w:val="none"/>
-                <w:strike w:val="false"/>
-                <w:sz w:val="22"/>
-                <w:szCs w:val="22"/>
-                <w:color w:val="000000"/>
-              </w:rPr>
-              <w:t xml:space="preserve">Guild</w:t>
-            </w:r>
-          </w:p>
-        </w:tc>
-        <w:tc>
-          <w:tcPr>
-            <w:tcBorders>
-              <w:bottom w:val="single" w:sz="12" w:space="0" w:color="666666"/>
-              <w:top w:val="single" w:sz="12" w:space="0" w:color="666666"/>
-              <w:left w:val="none" w:sz="0" w:space="0" w:color="000000"/>
-              <w:right w:val="none" w:sz="0" w:space="0" w:color="000000"/>
-            </w:tcBorders>
-            <w:shd w:val="clear" w:color="auto" w:fill="FFFFFF"/>
-            <w:tcMar>
-              <w:top w:w="0" w:type="dxa"/>
-              <w:bottom w:w="0" w:type="dxa"/>
-              <w:left w:w="0" w:type="dxa"/>
-              <w:right w:w="0" w:type="dxa"/>
-            </w:tcMar>
-            <w:vAlign w:val="center"/>
-          </w:tcPr>
-          <w:p>
-            <w:pPr>
-              <w:pStyle w:val="Normal"/>
-              <w:jc w:val="left"/>
-              <w:keepNext/>
-              <w:pBdr>
-                <w:bottom w:val="none" w:sz="0" w:space="0" w:color="000000"/>
-                <w:top w:val="none" w:sz="0" w:space="0" w:color="000000"/>
-                <w:left w:val="none" w:sz="0" w:space="0" w:color="000000"/>
-                <w:right w:val="none" w:sz="0" w:space="0" w:color="000000"/>
-              </w:pBdr>
-              <w:spacing w:after="40" w:before="40" w:line="240"/>
-              <w:ind w:left="100" w:right="100" w:firstLine="0" w:firstLineChars="0"/>
-              <w:rPr>
-                <w:rFonts w:ascii="Times New Roman" w:hAnsi="Helvetica" w:eastAsia="Helvetica" w:cs="Helvetica"/>
-                <w:i w:val="false"/>
-                <w:b w:val="false"/>
-                <w:u w:val="none"/>
-                <w:strike w:val="false"/>
-                <w:sz w:val="22"/>
-                <w:szCs w:val="22"/>
-                <w:color w:val="000000"/>
-              </w:rPr>
-            </w:pPr>
-            <w:r>
-              <w:rPr>
-                <w:rFonts w:ascii="Times New Roman" w:hAnsi="Helvetica" w:eastAsia="Helvetica" w:cs="Helvetica"/>
-                <w:i w:val="false"/>
-                <w:b w:val="false"/>
-                <w:u w:val="none"/>
-                <w:strike w:val="false"/>
-                <w:sz w:val="22"/>
-                <w:szCs w:val="22"/>
-                <w:color w:val="000000"/>
-              </w:rPr>
-              <w:t xml:space="preserve">BMP</w:t>
-            </w:r>
-          </w:p>
-        </w:tc>
-        <w:tc>
-          <w:tcPr>
-            <w:tcBorders>
-              <w:bottom w:val="single" w:sz="12" w:space="0" w:color="666666"/>
-              <w:top w:val="single" w:sz="12" w:space="0" w:color="666666"/>
-              <w:left w:val="none" w:sz="0" w:space="0" w:color="000000"/>
-              <w:right w:val="none" w:sz="0" w:space="0" w:color="000000"/>
-            </w:tcBorders>
-            <w:shd w:val="clear" w:color="auto" w:fill="FFFFFF"/>
-            <w:tcMar>
-              <w:top w:w="0" w:type="dxa"/>
-              <w:bottom w:w="0" w:type="dxa"/>
-              <w:left w:w="0" w:type="dxa"/>
-              <w:right w:w="0" w:type="dxa"/>
-            </w:tcMar>
-            <w:vAlign w:val="center"/>
-          </w:tcPr>
-          <w:p>
-            <w:pPr>
-              <w:pStyle w:val="Normal"/>
-              <w:jc w:val="center"/>
-              <w:keepNext/>
-              <w:pBdr>
-                <w:bottom w:val="none" w:sz="0" w:space="0" w:color="000000"/>
-                <w:top w:val="none" w:sz="0" w:space="0" w:color="000000"/>
-                <w:left w:val="none" w:sz="0" w:space="0" w:color="000000"/>
-                <w:right w:val="none" w:sz="0" w:space="0" w:color="000000"/>
-              </w:pBdr>
-              <w:spacing w:after="40" w:before="40" w:line="240"/>
-              <w:ind w:left="100" w:right="100" w:firstLine="0" w:firstLineChars="0"/>
-              <w:rPr>
-                <w:rFonts w:ascii="Times New Roman" w:hAnsi="Helvetica" w:eastAsia="Helvetica" w:cs="Helvetica"/>
-                <w:i w:val="false"/>
-                <w:b w:val="false"/>
-                <w:u w:val="none"/>
-                <w:strike w:val="false"/>
-                <w:sz w:val="22"/>
-                <w:szCs w:val="22"/>
-                <w:color w:val="000000"/>
-              </w:rPr>
-            </w:pPr>
-            <w:r>
-              <w:rPr>
-                <w:rFonts w:ascii="Times New Roman" w:hAnsi="Helvetica" w:eastAsia="Helvetica" w:cs="Helvetica"/>
-                <w:i w:val="false"/>
-                <w:b w:val="false"/>
-                <w:u w:val="none"/>
-                <w:strike w:val="false"/>
-                <w:sz w:val="22"/>
-                <w:szCs w:val="22"/>
-                <w:color w:val="000000"/>
-              </w:rPr>
-              <w:t xml:space="preserve">K</w:t>
-            </w:r>
-          </w:p>
-        </w:tc>
-        <w:tc>
-          <w:tcPr>
-            <w:tcBorders>
-              <w:bottom w:val="single" w:sz="12" w:space="0" w:color="666666"/>
-              <w:top w:val="single" w:sz="12" w:space="0" w:color="666666"/>
-              <w:left w:val="none" w:sz="0" w:space="0" w:color="000000"/>
-              <w:right w:val="none" w:sz="0" w:space="0" w:color="000000"/>
-            </w:tcBorders>
-            <w:shd w:val="clear" w:color="auto" w:fill="FFFFFF"/>
-            <w:tcMar>
-              <w:top w:w="0" w:type="dxa"/>
-              <w:bottom w:w="0" w:type="dxa"/>
-              <w:left w:w="0" w:type="dxa"/>
-              <w:right w:w="0" w:type="dxa"/>
-            </w:tcMar>
-            <w:vAlign w:val="center"/>
-          </w:tcPr>
-          <w:p>
-            <w:pPr>
-              <w:pStyle w:val="Normal"/>
-              <w:jc w:val="center"/>
-              <w:keepNext/>
-              <w:pBdr>
-                <w:bottom w:val="none" w:sz="0" w:space="0" w:color="000000"/>
-                <w:top w:val="none" w:sz="0" w:space="0" w:color="000000"/>
-                <w:left w:val="none" w:sz="0" w:space="0" w:color="000000"/>
-                <w:right w:val="none" w:sz="0" w:space="0" w:color="000000"/>
-              </w:pBdr>
-              <w:spacing w:after="40" w:before="40" w:line="240"/>
-              <w:ind w:left="100" w:right="100" w:firstLine="0" w:firstLineChars="0"/>
-              <w:rPr>
-                <w:rFonts w:ascii="Times New Roman" w:hAnsi="Helvetica" w:eastAsia="Helvetica" w:cs="Helvetica"/>
-                <w:i w:val="false"/>
-                <w:b w:val="false"/>
-                <w:u w:val="none"/>
-                <w:strike w:val="false"/>
-                <w:sz w:val="22"/>
-                <w:szCs w:val="22"/>
-                <w:color w:val="000000"/>
-              </w:rPr>
-            </w:pPr>
-            <w:r>
-              <w:rPr>
-                <w:rFonts w:ascii="Times New Roman" w:hAnsi="Helvetica" w:eastAsia="Helvetica" w:cs="Helvetica"/>
-                <w:i w:val="false"/>
-                <w:b w:val="false"/>
-                <w:u w:val="none"/>
-                <w:strike w:val="false"/>
-                <w:sz w:val="22"/>
-                <w:szCs w:val="22"/>
-                <w:color w:val="000000"/>
-              </w:rPr>
-              <w:t xml:space="preserve">Studies</w:t>
-            </w:r>
-          </w:p>
-        </w:tc>
-        <w:tc>
-          <w:tcPr>
-            <w:tcBorders>
-              <w:bottom w:val="single" w:sz="12" w:space="0" w:color="666666"/>
-              <w:top w:val="single" w:sz="12" w:space="0" w:color="666666"/>
-              <w:left w:val="none" w:sz="0" w:space="0" w:color="000000"/>
-              <w:right w:val="none" w:sz="0" w:space="0" w:color="000000"/>
-            </w:tcBorders>
-            <w:shd w:val="clear" w:color="auto" w:fill="FFFFFF"/>
-            <w:tcMar>
-              <w:top w:w="0" w:type="dxa"/>
-              <w:bottom w:w="0" w:type="dxa"/>
-              <w:left w:w="0" w:type="dxa"/>
-              <w:right w:w="0" w:type="dxa"/>
-            </w:tcMar>
-            <w:vAlign w:val="center"/>
-          </w:tcPr>
-          <w:p>
-            <w:pPr>
-              <w:pStyle w:val="Normal"/>
-              <w:jc w:val="center"/>
-              <w:keepNext/>
-              <w:pBdr>
-                <w:bottom w:val="none" w:sz="0" w:space="0" w:color="000000"/>
-                <w:top w:val="none" w:sz="0" w:space="0" w:color="000000"/>
-                <w:left w:val="none" w:sz="0" w:space="0" w:color="000000"/>
-                <w:right w:val="none" w:sz="0" w:space="0" w:color="000000"/>
-              </w:pBdr>
-              <w:spacing w:after="40" w:before="40" w:line="240"/>
-              <w:ind w:left="100" w:right="100" w:firstLine="0" w:firstLineChars="0"/>
-              <w:rPr>
-                <w:rFonts w:ascii="Times New Roman" w:hAnsi="Helvetica" w:eastAsia="Helvetica" w:cs="Helvetica"/>
-                <w:i w:val="false"/>
-                <w:b w:val="false"/>
-                <w:u w:val="none"/>
-                <w:strike w:val="false"/>
-                <w:sz w:val="22"/>
-                <w:szCs w:val="22"/>
-                <w:color w:val="000000"/>
-              </w:rPr>
-            </w:pPr>
-            <w:r>
-              <w:rPr>
-                <w:rFonts w:ascii="Times New Roman" w:hAnsi="Helvetica" w:eastAsia="Helvetica" w:cs="Helvetica"/>
-                <w:i w:val="false"/>
-                <w:b w:val="false"/>
-                <w:u w:val="none"/>
-                <w:strike w:val="false"/>
-                <w:sz w:val="22"/>
-                <w:szCs w:val="22"/>
-                <w:color w:val="000000"/>
-              </w:rPr>
-              <w:t xml:space="preserve">Effect size (95% CrI)</w:t>
-            </w:r>
-          </w:p>
-        </w:tc>
-        <w:tc>
-          <w:tcPr>
-            <w:tcBorders>
-              <w:bottom w:val="single" w:sz="12" w:space="0" w:color="666666"/>
-              <w:top w:val="single" w:sz="12" w:space="0" w:color="666666"/>
-              <w:left w:val="none" w:sz="0" w:space="0" w:color="000000"/>
-              <w:right w:val="none" w:sz="0" w:space="0" w:color="000000"/>
-            </w:tcBorders>
-            <w:shd w:val="clear" w:color="auto" w:fill="FFFFFF"/>
-            <w:tcMar>
-              <w:top w:w="0" w:type="dxa"/>
-              <w:bottom w:w="0" w:type="dxa"/>
-              <w:left w:w="0" w:type="dxa"/>
-              <w:right w:w="0" w:type="dxa"/>
-            </w:tcMar>
-            <w:vAlign w:val="center"/>
-          </w:tcPr>
-          <w:p>
-            <w:pPr>
-              <w:pStyle w:val="Normal"/>
-              <w:jc w:val="center"/>
-              <w:keepNext/>
-              <w:pBdr>
-                <w:bottom w:val="none" w:sz="0" w:space="0" w:color="000000"/>
-                <w:top w:val="none" w:sz="0" w:space="0" w:color="000000"/>
-                <w:left w:val="none" w:sz="0" w:space="0" w:color="000000"/>
-                <w:right w:val="none" w:sz="0" w:space="0" w:color="000000"/>
-              </w:pBdr>
-              <w:spacing w:after="40" w:before="40" w:line="240"/>
-              <w:ind w:left="100" w:right="100" w:firstLine="0" w:firstLineChars="0"/>
-              <w:rPr>
-                <w:rFonts w:ascii="Times New Roman" w:hAnsi="Helvetica" w:eastAsia="Helvetica" w:cs="Helvetica"/>
-                <w:i w:val="false"/>
-                <w:b w:val="false"/>
-                <w:u w:val="none"/>
-                <w:strike w:val="false"/>
-                <w:sz w:val="22"/>
-                <w:szCs w:val="22"/>
-                <w:color w:val="000000"/>
-              </w:rPr>
-            </w:pPr>
-            <w:r>
-              <w:rPr>
-                <w:rFonts w:ascii="Times New Roman" w:hAnsi="Helvetica" w:eastAsia="Helvetica" w:cs="Helvetica"/>
-                <w:i w:val="false"/>
-                <w:b w:val="false"/>
-                <w:u w:val="none"/>
-                <w:strike w:val="false"/>
-                <w:sz w:val="22"/>
-                <w:szCs w:val="22"/>
-                <w:color w:val="000000"/>
-              </w:rPr>
-              <w:t xml:space="preserve">P(effect &gt; 0)</w:t>
-            </w:r>
-          </w:p>
-        </w:tc>
-      </w:tr>
-      <w:tr>
-        <w:trPr>
-          <w:cantSplit/>
-          <w:trHeight w:val="608" w:hRule="auto"/>
-        </w:trPr>
-        <w:tc>
-          <w:tcPr>
-            <w:tcBorders>
-              <w:bottom w:val="single" w:sz="4" w:space="0" w:color="666666"/>
-              <w:top w:val="single" w:sz="12" w:space="0" w:color="666666"/>
-              <w:left w:val="none" w:sz="0" w:space="0" w:color="000000"/>
-              <w:right w:val="none" w:sz="0" w:space="0" w:color="000000"/>
-            </w:tcBorders>
-            <w:shd w:val="clear" w:color="auto" w:fill="FFFFFF"/>
-            <w:tcMar>
-              <w:top w:w="0" w:type="dxa"/>
-              <w:bottom w:w="0" w:type="dxa"/>
-              <w:left w:w="0" w:type="dxa"/>
-              <w:right w:w="0" w:type="dxa"/>
-            </w:tcMar>
-            <w:vAlign w:val="center"/>
-          </w:tcPr>
-          <w:p>
-            <w:pPr>
-              <w:pStyle w:val="Normal"/>
-              <w:jc w:val="center"/>
-              <w:keepNext/>
-              <w:pBdr>
-                <w:bottom w:val="none" w:sz="0" w:space="0" w:color="000000"/>
-                <w:top w:val="none" w:sz="0" w:space="0" w:color="000000"/>
-                <w:left w:val="none" w:sz="0" w:space="0" w:color="000000"/>
-                <w:right w:val="none" w:sz="0" w:space="0" w:color="000000"/>
-              </w:pBdr>
-              <w:spacing w:after="40" w:before="40" w:line="240"/>
-              <w:ind w:left="100" w:right="100" w:firstLine="0" w:firstLineChars="0"/>
-              <w:rPr>
-                <w:rFonts w:ascii="Times New Roman" w:hAnsi="Helvetica" w:eastAsia="Helvetica" w:cs="Helvetica"/>
-                <w:i w:val="false"/>
-                <w:b w:val="false"/>
-                <w:u w:val="none"/>
-                <w:strike w:val="false"/>
-                <w:sz w:val="20"/>
-                <w:szCs w:val="20"/>
-                <w:color w:val="000000"/>
-              </w:rPr>
-            </w:pPr>
-            <w:r>
-              <w:rPr>
-                <w:rFonts w:ascii="Times New Roman" w:hAnsi="Helvetica" w:eastAsia="Helvetica" w:cs="Helvetica"/>
-                <w:i w:val="false"/>
-                <w:b w:val="false"/>
-                <w:u w:val="none"/>
-                <w:strike w:val="false"/>
-                <w:sz w:val="20"/>
-                <w:szCs w:val="20"/>
-                <w:color w:val="000000"/>
-              </w:rPr>
-              <w:t xml:space="preserve">Facultative</w:t>
-            </w:r>
-          </w:p>
-        </w:tc>
-        <w:tc>
-          <w:tcPr>
-            <w:tcBorders>
-              <w:bottom w:val="single" w:sz="4" w:space="0" w:color="666666"/>
-              <w:top w:val="single" w:sz="12" w:space="0" w:color="666666"/>
-              <w:left w:val="none" w:sz="0" w:space="0" w:color="000000"/>
-              <w:right w:val="none" w:sz="0" w:space="0" w:color="000000"/>
-            </w:tcBorders>
-            <w:shd w:val="clear" w:color="auto" w:fill="FFFFFF"/>
-            <w:tcMar>
-              <w:top w:w="0" w:type="dxa"/>
-              <w:bottom w:w="0" w:type="dxa"/>
-              <w:left w:w="0" w:type="dxa"/>
-              <w:right w:w="0" w:type="dxa"/>
-            </w:tcMar>
-            <w:vAlign w:val="center"/>
-          </w:tcPr>
-          <w:p>
-            <w:pPr>
-              <w:pStyle w:val="Normal"/>
-              <w:jc w:val="left"/>
-              <w:keepNext/>
-              <w:pBdr>
-                <w:bottom w:val="none" w:sz="0" w:space="0" w:color="000000"/>
-                <w:top w:val="none" w:sz="0" w:space="0" w:color="000000"/>
-                <w:left w:val="none" w:sz="0" w:space="0" w:color="000000"/>
-                <w:right w:val="none" w:sz="0" w:space="0" w:color="000000"/>
-              </w:pBdr>
-              <w:spacing w:after="40" w:before="40" w:line="240"/>
-              <w:ind w:left="100" w:right="100" w:firstLine="0" w:firstLineChars="0"/>
-              <w:rPr>
-                <w:rFonts w:ascii="Times New Roman" w:hAnsi="Helvetica" w:eastAsia="Helvetica" w:cs="Helvetica"/>
-                <w:i w:val="false"/>
-                <w:b w:val="false"/>
-                <w:u w:val="none"/>
-                <w:strike w:val="false"/>
-                <w:sz w:val="20"/>
-                <w:szCs w:val="20"/>
-                <w:color w:val="000000"/>
-              </w:rPr>
-            </w:pPr>
-            <w:r>
-              <w:rPr>
-                <w:rFonts w:ascii="Times New Roman" w:hAnsi="Helvetica" w:eastAsia="Helvetica" w:cs="Helvetica"/>
-                <w:i w:val="false"/>
-                <w:b w:val="false"/>
-                <w:u w:val="none"/>
-                <w:strike w:val="false"/>
-                <w:sz w:val="20"/>
-                <w:szCs w:val="20"/>
-                <w:color w:val="000000"/>
-              </w:rPr>
-              <w:t xml:space="preserve">Promote Edge and Shrub Habitat</w:t>
-            </w:r>
-          </w:p>
-        </w:tc>
-        <w:tc>
-          <w:tcPr>
-            <w:tcBorders>
-              <w:bottom w:val="single" w:sz="4" w:space="0" w:color="666666"/>
-              <w:top w:val="single" w:sz="12" w:space="0" w:color="666666"/>
-              <w:left w:val="none" w:sz="0" w:space="0" w:color="000000"/>
-              <w:right w:val="none" w:sz="0" w:space="0" w:color="000000"/>
-            </w:tcBorders>
-            <w:shd w:val="clear" w:color="auto" w:fill="FFFFFF"/>
-            <w:tcMar>
-              <w:top w:w="0" w:type="dxa"/>
-              <w:bottom w:w="0" w:type="dxa"/>
-              <w:left w:w="0" w:type="dxa"/>
-              <w:right w:w="0" w:type="dxa"/>
-            </w:tcMar>
-            <w:vAlign w:val="center"/>
-          </w:tcPr>
-          <w:p>
-            <w:pPr>
-              <w:pStyle w:val="Normal"/>
-              <w:jc w:val="center"/>
-              <w:keepNext/>
-              <w:pBdr>
-                <w:bottom w:val="none" w:sz="0" w:space="0" w:color="000000"/>
-                <w:top w:val="none" w:sz="0" w:space="0" w:color="000000"/>
-                <w:left w:val="none" w:sz="0" w:space="0" w:color="000000"/>
-                <w:right w:val="none" w:sz="0" w:space="0" w:color="000000"/>
-              </w:pBdr>
-              <w:spacing w:after="40" w:before="40" w:line="240"/>
-              <w:ind w:left="100" w:right="100" w:firstLine="0" w:firstLineChars="0"/>
-              <w:rPr>
-                <w:rFonts w:ascii="Times New Roman" w:hAnsi="Helvetica" w:eastAsia="Helvetica" w:cs="Helvetica"/>
-                <w:i w:val="false"/>
-                <w:b w:val="false"/>
-                <w:u w:val="none"/>
-                <w:strike w:val="false"/>
-                <w:sz w:val="20"/>
-                <w:szCs w:val="20"/>
-                <w:color w:val="000000"/>
-              </w:rPr>
-            </w:pPr>
-            <w:r>
-              <w:rPr>
-                <w:rFonts w:ascii="Times New Roman" w:hAnsi="Helvetica" w:eastAsia="Helvetica" w:cs="Helvetica"/>
-                <w:i w:val="false"/>
-                <w:b w:val="false"/>
-                <w:u w:val="none"/>
-                <w:strike w:val="false"/>
-                <w:sz w:val="20"/>
-                <w:szCs w:val="20"/>
-                <w:color w:val="000000"/>
-              </w:rPr>
-              <w:t xml:space="preserve">8</w:t>
-            </w:r>
-          </w:p>
-        </w:tc>
-        <w:tc>
-          <w:tcPr>
-            <w:tcBorders>
-              <w:bottom w:val="single" w:sz="4" w:space="0" w:color="666666"/>
-              <w:top w:val="single" w:sz="12" w:space="0" w:color="666666"/>
-              <w:left w:val="none" w:sz="0" w:space="0" w:color="000000"/>
-              <w:right w:val="none" w:sz="0" w:space="0" w:color="000000"/>
-            </w:tcBorders>
-            <w:shd w:val="clear" w:color="auto" w:fill="FFFFFF"/>
-            <w:tcMar>
-              <w:top w:w="0" w:type="dxa"/>
-              <w:bottom w:w="0" w:type="dxa"/>
-              <w:left w:w="0" w:type="dxa"/>
-              <w:right w:w="0" w:type="dxa"/>
-            </w:tcMar>
-            <w:vAlign w:val="center"/>
-          </w:tcPr>
-          <w:p>
-            <w:pPr>
-              <w:pStyle w:val="Normal"/>
-              <w:jc w:val="center"/>
-              <w:keepNext/>
-              <w:pBdr>
-                <w:bottom w:val="none" w:sz="0" w:space="0" w:color="000000"/>
-                <w:top w:val="none" w:sz="0" w:space="0" w:color="000000"/>
-                <w:left w:val="none" w:sz="0" w:space="0" w:color="000000"/>
-                <w:right w:val="none" w:sz="0" w:space="0" w:color="000000"/>
-              </w:pBdr>
-              <w:spacing w:after="40" w:before="40" w:line="240"/>
-              <w:ind w:left="100" w:right="100" w:firstLine="0" w:firstLineChars="0"/>
-              <w:rPr>
-                <w:rFonts w:ascii="Times New Roman" w:hAnsi="Helvetica" w:eastAsia="Helvetica" w:cs="Helvetica"/>
-                <w:i w:val="false"/>
-                <w:b w:val="false"/>
-                <w:u w:val="none"/>
-                <w:strike w:val="false"/>
-                <w:sz w:val="20"/>
-                <w:szCs w:val="20"/>
-                <w:color w:val="000000"/>
-              </w:rPr>
-            </w:pPr>
-            <w:r>
-              <w:rPr>
-                <w:rFonts w:ascii="Times New Roman" w:hAnsi="Helvetica" w:eastAsia="Helvetica" w:cs="Helvetica"/>
-                <w:i w:val="false"/>
-                <w:b w:val="false"/>
-                <w:u w:val="none"/>
-                <w:strike w:val="false"/>
-                <w:sz w:val="20"/>
-                <w:szCs w:val="20"/>
-                <w:color w:val="000000"/>
-              </w:rPr>
-              <w:t xml:space="preserve">3</w:t>
-            </w:r>
-          </w:p>
-        </w:tc>
-        <w:tc>
-          <w:tcPr>
-            <w:tcBorders>
-              <w:bottom w:val="single" w:sz="4" w:space="0" w:color="666666"/>
-              <w:top w:val="single" w:sz="12" w:space="0" w:color="666666"/>
-              <w:left w:val="none" w:sz="0" w:space="0" w:color="000000"/>
-              <w:right w:val="none" w:sz="0" w:space="0" w:color="000000"/>
-            </w:tcBorders>
-            <w:shd w:val="clear" w:color="auto" w:fill="FFFFFF"/>
-            <w:tcMar>
-              <w:top w:w="0" w:type="dxa"/>
-              <w:bottom w:w="0" w:type="dxa"/>
-              <w:left w:w="0" w:type="dxa"/>
-              <w:right w:w="0" w:type="dxa"/>
-            </w:tcMar>
-            <w:vAlign w:val="center"/>
-          </w:tcPr>
-          <w:p>
-            <w:pPr>
-              <w:pStyle w:val="Normal"/>
-              <w:jc w:val="center"/>
-              <w:keepNext/>
-              <w:pBdr>
-                <w:bottom w:val="none" w:sz="0" w:space="0" w:color="000000"/>
-                <w:top w:val="none" w:sz="0" w:space="0" w:color="000000"/>
-                <w:left w:val="none" w:sz="0" w:space="0" w:color="000000"/>
-                <w:right w:val="none" w:sz="0" w:space="0" w:color="000000"/>
-              </w:pBdr>
-              <w:spacing w:after="40" w:before="40" w:line="240"/>
-              <w:ind w:left="100" w:right="100" w:firstLine="0" w:firstLineChars="0"/>
-              <w:rPr>
-                <w:rFonts w:ascii="Times New Roman" w:hAnsi="Helvetica" w:eastAsia="Helvetica" w:cs="Helvetica"/>
-                <w:i w:val="false"/>
-                <w:b w:val="false"/>
-                <w:u w:val="none"/>
-                <w:strike w:val="false"/>
-                <w:sz w:val="20"/>
-                <w:szCs w:val="20"/>
-                <w:color w:val="000000"/>
-              </w:rPr>
-            </w:pPr>
-            <w:r>
-              <w:rPr>
-                <w:rFonts w:ascii="Times New Roman" w:hAnsi="Helvetica" w:eastAsia="Helvetica" w:cs="Helvetica"/>
-                <w:i w:val="false"/>
-                <w:b w:val="false"/>
-                <w:u w:val="none"/>
-                <w:strike w:val="false"/>
-                <w:sz w:val="20"/>
-                <w:szCs w:val="20"/>
-                <w:color w:val="000000"/>
-              </w:rPr>
-              <w:t xml:space="preserve">0.37 (-0.28, 0.93)</w:t>
-            </w:r>
-          </w:p>
-        </w:tc>
-        <w:tc>
-          <w:tcPr>
-            <w:tcBorders>
-              <w:bottom w:val="single" w:sz="4" w:space="0" w:color="666666"/>
-              <w:top w:val="single" w:sz="12" w:space="0" w:color="666666"/>
-              <w:left w:val="none" w:sz="0" w:space="0" w:color="000000"/>
-              <w:right w:val="none" w:sz="0" w:space="0" w:color="000000"/>
-            </w:tcBorders>
-            <w:shd w:val="clear" w:color="auto" w:fill="FFFFFF"/>
-            <w:tcMar>
-              <w:top w:w="0" w:type="dxa"/>
-              <w:bottom w:w="0" w:type="dxa"/>
-              <w:left w:w="0" w:type="dxa"/>
-              <w:right w:w="0" w:type="dxa"/>
-            </w:tcMar>
-            <w:vAlign w:val="center"/>
-          </w:tcPr>
-          <w:p>
-            <w:pPr>
-              <w:pStyle w:val="Normal"/>
-              <w:jc w:val="center"/>
-              <w:keepNext/>
-              <w:pBdr>
-                <w:bottom w:val="none" w:sz="0" w:space="0" w:color="000000"/>
-                <w:top w:val="none" w:sz="0" w:space="0" w:color="000000"/>
-                <w:left w:val="none" w:sz="0" w:space="0" w:color="000000"/>
-                <w:right w:val="none" w:sz="0" w:space="0" w:color="000000"/>
-              </w:pBdr>
-              <w:spacing w:after="40" w:before="40" w:line="240"/>
-              <w:ind w:left="100" w:right="100" w:firstLine="0" w:firstLineChars="0"/>
-              <w:rPr>
-                <w:rFonts w:ascii="Times New Roman" w:hAnsi="Helvetica" w:eastAsia="Helvetica" w:cs="Helvetica"/>
-                <w:i w:val="false"/>
-                <w:b w:val="false"/>
-                <w:u w:val="none"/>
-                <w:strike w:val="false"/>
-                <w:sz w:val="20"/>
-                <w:szCs w:val="20"/>
-                <w:color w:val="000000"/>
-              </w:rPr>
-            </w:pPr>
-            <w:r>
-              <w:rPr>
-                <w:rFonts w:ascii="Times New Roman" w:hAnsi="Helvetica" w:eastAsia="Helvetica" w:cs="Helvetica"/>
-                <w:i w:val="false"/>
-                <w:b w:val="false"/>
-                <w:u w:val="none"/>
-                <w:strike w:val="false"/>
-                <w:sz w:val="20"/>
-                <w:szCs w:val="20"/>
-                <w:color w:val="000000"/>
-              </w:rPr>
-              <w:t xml:space="preserve">0.885</w:t>
-            </w:r>
-          </w:p>
-        </w:tc>
-      </w:tr>
-      <w:tr>
-        <w:trPr>
-          <w:cantSplit/>
-          <w:trHeight w:val="608" w:hRule="auto"/>
-        </w:trPr>
-        <w:tc>
-          <w:tcPr>
-            <w:vMerge w:val="restart"/>
-            <w:tcBorders>
-              <w:bottom w:val="single" w:sz="4" w:space="0" w:color="666666"/>
-              <w:top w:val="single" w:sz="4" w:space="0" w:color="666666"/>
-              <w:left w:val="none" w:sz="0" w:space="0" w:color="000000"/>
-              <w:right w:val="none" w:sz="0" w:space="0" w:color="000000"/>
-            </w:tcBorders>
-            <w:shd w:val="clear" w:color="auto" w:fill="FFFFFF"/>
-            <w:tcMar>
-              <w:top w:w="0" w:type="dxa"/>
-              <w:bottom w:w="0" w:type="dxa"/>
-              <w:left w:w="0" w:type="dxa"/>
-              <w:right w:w="0" w:type="dxa"/>
-            </w:tcMar>
-            <w:vAlign w:val="center"/>
-          </w:tcPr>
-          <w:p>
-            <w:pPr>
-              <w:pStyle w:val="Normal"/>
-              <w:jc w:val="center"/>
-              <w:keepNext/>
-              <w:pBdr>
-                <w:bottom w:val="none" w:sz="0" w:space="0" w:color="000000"/>
-                <w:top w:val="none" w:sz="0" w:space="0" w:color="000000"/>
-                <w:left w:val="none" w:sz="0" w:space="0" w:color="000000"/>
-                <w:right w:val="none" w:sz="0" w:space="0" w:color="000000"/>
-              </w:pBdr>
-              <w:spacing w:after="40" w:before="40" w:line="240"/>
-              <w:ind w:left="100" w:right="100" w:firstLine="0" w:firstLineChars="0"/>
-              <w:rPr>
-                <w:rFonts w:ascii="Times New Roman" w:hAnsi="Helvetica" w:eastAsia="Helvetica" w:cs="Helvetica"/>
-                <w:i w:val="false"/>
-                <w:b w:val="true"/>
-                <w:u w:val="none"/>
-                <w:strike w:val="false"/>
-                <w:sz w:val="20"/>
-                <w:szCs w:val="20"/>
-                <w:color w:val="000000"/>
-              </w:rPr>
-            </w:pPr>
-            <w:r>
-              <w:rPr>
-                <w:rFonts w:ascii="Times New Roman" w:hAnsi="Helvetica" w:eastAsia="Helvetica" w:cs="Helvetica"/>
-                <w:i w:val="false"/>
-                <w:b w:val="true"/>
-                <w:u w:val="none"/>
-                <w:strike w:val="false"/>
-                <w:sz w:val="20"/>
-                <w:szCs w:val="20"/>
-                <w:color w:val="000000"/>
-              </w:rPr>
-              <w:t xml:space="preserve">Obligate</w:t>
-            </w:r>
-          </w:p>
-        </w:tc>
-        <w:tc>
-          <w:tcPr>
-            <w:tcBorders>
-              <w:bottom w:val="none" w:sz="0" w:space="0" w:color="000000"/>
-              <w:top w:val="single" w:sz="4" w:space="0" w:color="666666"/>
-              <w:left w:val="none" w:sz="0" w:space="0" w:color="000000"/>
-              <w:right w:val="none" w:sz="0" w:space="0" w:color="000000"/>
-            </w:tcBorders>
-            <w:shd w:val="clear" w:color="auto" w:fill="FFFFFF"/>
-            <w:tcMar>
-              <w:top w:w="0" w:type="dxa"/>
-              <w:bottom w:w="0" w:type="dxa"/>
-              <w:left w:w="0" w:type="dxa"/>
-              <w:right w:w="0" w:type="dxa"/>
-            </w:tcMar>
-            <w:vAlign w:val="center"/>
-          </w:tcPr>
-          <w:p>
-            <w:pPr>
-              <w:pStyle w:val="Normal"/>
-              <w:jc w:val="left"/>
-              <w:keepNext/>
-              <w:pBdr>
-                <w:bottom w:val="none" w:sz="0" w:space="0" w:color="000000"/>
-                <w:top w:val="none" w:sz="0" w:space="0" w:color="000000"/>
-                <w:left w:val="none" w:sz="0" w:space="0" w:color="000000"/>
-                <w:right w:val="none" w:sz="0" w:space="0" w:color="000000"/>
-              </w:pBdr>
-              <w:spacing w:after="40" w:before="40" w:line="240"/>
-              <w:ind w:left="100" w:right="100" w:firstLine="0" w:firstLineChars="0"/>
-              <w:rPr>
-                <w:rFonts w:ascii="Times New Roman" w:hAnsi="Helvetica" w:eastAsia="Helvetica" w:cs="Helvetica"/>
-                <w:i w:val="false"/>
-                <w:b w:val="true"/>
-                <w:u w:val="none"/>
-                <w:strike w:val="false"/>
-                <w:sz w:val="20"/>
-                <w:szCs w:val="20"/>
-                <w:color w:val="000000"/>
-              </w:rPr>
-            </w:pPr>
-            <w:r>
-              <w:rPr>
-                <w:rFonts w:ascii="Times New Roman" w:hAnsi="Helvetica" w:eastAsia="Helvetica" w:cs="Helvetica"/>
-                <w:i w:val="false"/>
-                <w:b w:val="true"/>
-                <w:u w:val="none"/>
-                <w:strike w:val="false"/>
-                <w:sz w:val="20"/>
-                <w:szCs w:val="20"/>
-                <w:color w:val="000000"/>
-              </w:rPr>
-              <w:t xml:space="preserve">Avoid Haying During Nesting Season</w:t>
-            </w:r>
-          </w:p>
-        </w:tc>
-        <w:tc>
-          <w:tcPr>
-            <w:tcBorders>
-              <w:bottom w:val="none" w:sz="0" w:space="0" w:color="000000"/>
-              <w:top w:val="single" w:sz="4" w:space="0" w:color="666666"/>
-              <w:left w:val="none" w:sz="0" w:space="0" w:color="000000"/>
-              <w:right w:val="none" w:sz="0" w:space="0" w:color="000000"/>
-            </w:tcBorders>
-            <w:shd w:val="clear" w:color="auto" w:fill="FFFFFF"/>
-            <w:tcMar>
-              <w:top w:w="0" w:type="dxa"/>
-              <w:bottom w:w="0" w:type="dxa"/>
-              <w:left w:w="0" w:type="dxa"/>
-              <w:right w:w="0" w:type="dxa"/>
-            </w:tcMar>
-            <w:vAlign w:val="center"/>
-          </w:tcPr>
-          <w:p>
-            <w:pPr>
-              <w:pStyle w:val="Normal"/>
-              <w:jc w:val="center"/>
-              <w:keepNext/>
-              <w:pBdr>
-                <w:bottom w:val="none" w:sz="0" w:space="0" w:color="000000"/>
-                <w:top w:val="none" w:sz="0" w:space="0" w:color="000000"/>
-                <w:left w:val="none" w:sz="0" w:space="0" w:color="000000"/>
-                <w:right w:val="none" w:sz="0" w:space="0" w:color="000000"/>
-              </w:pBdr>
-              <w:spacing w:after="40" w:before="40" w:line="240"/>
-              <w:ind w:left="100" w:right="100" w:firstLine="0" w:firstLineChars="0"/>
-              <w:rPr>
-                <w:rFonts w:ascii="Times New Roman" w:hAnsi="Helvetica" w:eastAsia="Helvetica" w:cs="Helvetica"/>
-                <w:i w:val="false"/>
-                <w:b w:val="true"/>
-                <w:u w:val="none"/>
-                <w:strike w:val="false"/>
-                <w:sz w:val="20"/>
-                <w:szCs w:val="20"/>
-                <w:color w:val="000000"/>
-              </w:rPr>
-            </w:pPr>
-            <w:r>
-              <w:rPr>
-                <w:rFonts w:ascii="Times New Roman" w:hAnsi="Helvetica" w:eastAsia="Helvetica" w:cs="Helvetica"/>
-                <w:i w:val="false"/>
-                <w:b w:val="true"/>
-                <w:u w:val="none"/>
-                <w:strike w:val="false"/>
-                <w:sz w:val="20"/>
-                <w:szCs w:val="20"/>
-                <w:color w:val="000000"/>
-              </w:rPr>
-              <w:t xml:space="preserve">7</w:t>
-            </w:r>
-          </w:p>
-        </w:tc>
-        <w:tc>
-          <w:tcPr>
-            <w:tcBorders>
-              <w:bottom w:val="none" w:sz="0" w:space="0" w:color="000000"/>
-              <w:top w:val="single" w:sz="4" w:space="0" w:color="666666"/>
-              <w:left w:val="none" w:sz="0" w:space="0" w:color="000000"/>
-              <w:right w:val="none" w:sz="0" w:space="0" w:color="000000"/>
-            </w:tcBorders>
-            <w:shd w:val="clear" w:color="auto" w:fill="FFFFFF"/>
-            <w:tcMar>
-              <w:top w:w="0" w:type="dxa"/>
-              <w:bottom w:w="0" w:type="dxa"/>
-              <w:left w:w="0" w:type="dxa"/>
-              <w:right w:w="0" w:type="dxa"/>
-            </w:tcMar>
-            <w:vAlign w:val="center"/>
-          </w:tcPr>
-          <w:p>
-            <w:pPr>
-              <w:pStyle w:val="Normal"/>
-              <w:jc w:val="center"/>
-              <w:keepNext/>
-              <w:pBdr>
-                <w:bottom w:val="none" w:sz="0" w:space="0" w:color="000000"/>
-                <w:top w:val="none" w:sz="0" w:space="0" w:color="000000"/>
-                <w:left w:val="none" w:sz="0" w:space="0" w:color="000000"/>
-                <w:right w:val="none" w:sz="0" w:space="0" w:color="000000"/>
-              </w:pBdr>
-              <w:spacing w:after="40" w:before="40" w:line="240"/>
-              <w:ind w:left="100" w:right="100" w:firstLine="0" w:firstLineChars="0"/>
-              <w:rPr>
-                <w:rFonts w:ascii="Times New Roman" w:hAnsi="Helvetica" w:eastAsia="Helvetica" w:cs="Helvetica"/>
-                <w:i w:val="false"/>
-                <w:b w:val="true"/>
-                <w:u w:val="none"/>
-                <w:strike w:val="false"/>
-                <w:sz w:val="20"/>
-                <w:szCs w:val="20"/>
-                <w:color w:val="000000"/>
-              </w:rPr>
-            </w:pPr>
-            <w:r>
-              <w:rPr>
-                <w:rFonts w:ascii="Times New Roman" w:hAnsi="Helvetica" w:eastAsia="Helvetica" w:cs="Helvetica"/>
-                <w:i w:val="false"/>
-                <w:b w:val="true"/>
-                <w:u w:val="none"/>
-                <w:strike w:val="false"/>
-                <w:sz w:val="20"/>
-                <w:szCs w:val="20"/>
-                <w:color w:val="000000"/>
-              </w:rPr>
-              <w:t xml:space="preserve">4</w:t>
-            </w:r>
-          </w:p>
-        </w:tc>
-        <w:tc>
-          <w:tcPr>
-            <w:tcBorders>
-              <w:bottom w:val="none" w:sz="0" w:space="0" w:color="000000"/>
-              <w:top w:val="single" w:sz="4" w:space="0" w:color="666666"/>
-              <w:left w:val="none" w:sz="0" w:space="0" w:color="000000"/>
-              <w:right w:val="none" w:sz="0" w:space="0" w:color="000000"/>
-            </w:tcBorders>
-            <w:shd w:val="clear" w:color="auto" w:fill="FFFFFF"/>
-            <w:tcMar>
-              <w:top w:w="0" w:type="dxa"/>
-              <w:bottom w:w="0" w:type="dxa"/>
-              <w:left w:w="0" w:type="dxa"/>
-              <w:right w:w="0" w:type="dxa"/>
-            </w:tcMar>
-            <w:vAlign w:val="center"/>
-          </w:tcPr>
-          <w:p>
-            <w:pPr>
-              <w:pStyle w:val="Normal"/>
-              <w:jc w:val="center"/>
-              <w:keepNext/>
-              <w:pBdr>
-                <w:bottom w:val="none" w:sz="0" w:space="0" w:color="000000"/>
-                <w:top w:val="none" w:sz="0" w:space="0" w:color="000000"/>
-                <w:left w:val="none" w:sz="0" w:space="0" w:color="000000"/>
-                <w:right w:val="none" w:sz="0" w:space="0" w:color="000000"/>
-              </w:pBdr>
-              <w:spacing w:after="40" w:before="40" w:line="240"/>
-              <w:ind w:left="100" w:right="100" w:firstLine="0" w:firstLineChars="0"/>
-              <w:rPr>
-                <w:rFonts w:ascii="Times New Roman" w:hAnsi="Helvetica" w:eastAsia="Helvetica" w:cs="Helvetica"/>
-                <w:i w:val="false"/>
-                <w:b w:val="true"/>
-                <w:u w:val="none"/>
-                <w:strike w:val="false"/>
-                <w:sz w:val="20"/>
-                <w:szCs w:val="20"/>
-                <w:color w:val="000000"/>
-              </w:rPr>
-            </w:pPr>
-            <w:r>
-              <w:rPr>
-                <w:rFonts w:ascii="Times New Roman" w:hAnsi="Helvetica" w:eastAsia="Helvetica" w:cs="Helvetica"/>
-                <w:i w:val="false"/>
-                <w:b w:val="true"/>
-                <w:u w:val="none"/>
-                <w:strike w:val="false"/>
-                <w:sz w:val="20"/>
-                <w:szCs w:val="20"/>
-                <w:color w:val="000000"/>
-              </w:rPr>
-              <w:t xml:space="preserve">0.98 (0.45, 1.51)</w:t>
-            </w:r>
-          </w:p>
-        </w:tc>
-        <w:tc>
-          <w:tcPr>
-            <w:tcBorders>
-              <w:bottom w:val="none" w:sz="0" w:space="0" w:color="000000"/>
-              <w:top w:val="single" w:sz="4" w:space="0" w:color="666666"/>
-              <w:left w:val="none" w:sz="0" w:space="0" w:color="000000"/>
-              <w:right w:val="none" w:sz="0" w:space="0" w:color="000000"/>
-            </w:tcBorders>
-            <w:shd w:val="clear" w:color="auto" w:fill="FFFFFF"/>
-            <w:tcMar>
-              <w:top w:w="0" w:type="dxa"/>
-              <w:bottom w:w="0" w:type="dxa"/>
-              <w:left w:w="0" w:type="dxa"/>
-              <w:right w:w="0" w:type="dxa"/>
-            </w:tcMar>
-            <w:vAlign w:val="center"/>
-          </w:tcPr>
-          <w:p>
-            <w:pPr>
-              <w:pStyle w:val="Normal"/>
-              <w:jc w:val="center"/>
-              <w:keepNext/>
-              <w:pBdr>
-                <w:bottom w:val="none" w:sz="0" w:space="0" w:color="000000"/>
-                <w:top w:val="none" w:sz="0" w:space="0" w:color="000000"/>
-                <w:left w:val="none" w:sz="0" w:space="0" w:color="000000"/>
-                <w:right w:val="none" w:sz="0" w:space="0" w:color="000000"/>
-              </w:pBdr>
-              <w:spacing w:after="40" w:before="40" w:line="240"/>
-              <w:ind w:left="100" w:right="100" w:firstLine="0" w:firstLineChars="0"/>
-              <w:rPr>
-                <w:rFonts w:ascii="Times New Roman" w:hAnsi="Helvetica" w:eastAsia="Helvetica" w:cs="Helvetica"/>
-                <w:i w:val="false"/>
-                <w:b w:val="true"/>
-                <w:u w:val="none"/>
-                <w:strike w:val="false"/>
-                <w:sz w:val="20"/>
-                <w:szCs w:val="20"/>
-                <w:color w:val="000000"/>
-              </w:rPr>
-            </w:pPr>
-            <w:r>
-              <w:rPr>
-                <w:rFonts w:ascii="Times New Roman" w:hAnsi="Helvetica" w:eastAsia="Helvetica" w:cs="Helvetica"/>
-                <w:i w:val="false"/>
-                <w:b w:val="true"/>
-                <w:u w:val="none"/>
-                <w:strike w:val="false"/>
-                <w:sz w:val="20"/>
-                <w:szCs w:val="20"/>
-                <w:color w:val="000000"/>
-              </w:rPr>
-              <w:t xml:space="preserve">0.999</w:t>
-            </w:r>
-          </w:p>
-        </w:tc>
-      </w:tr>
-      <w:tr>
-        <w:trPr>
-          <w:cantSplit/>
-          <w:trHeight w:val="608" w:hRule="auto"/>
-        </w:trPr>
-        <w:tc>
-          <w:tcPr>
-            <w:vMerge/>
-            <w:tcBorders>
-              <w:bottom w:val="none" w:sz="0" w:space="0" w:color="000000"/>
-              <w:top w:val="single" w:sz="4" w:space="0" w:color="666666"/>
-              <w:left w:val="none" w:sz="0" w:space="0" w:color="000000"/>
-              <w:right w:val="none" w:sz="0" w:space="0" w:color="000000"/>
-            </w:tcBorders>
-            <w:shd w:val="clear" w:color="auto" w:fill="FFFFFF"/>
-            <w:tcMar>
-              <w:top w:w="0" w:type="dxa"/>
-              <w:bottom w:w="0" w:type="dxa"/>
-              <w:left w:w="0" w:type="dxa"/>
-              <w:right w:w="0" w:type="dxa"/>
-            </w:tcMar>
-            <w:vAlign w:val="center"/>
-          </w:tcPr>
-          <w:p>
-            <w:pPr>
-              <w:pStyle w:val="Normal"/>
-              <w:jc w:val="center"/>
-              <w:keepNext/>
-              <w:pBdr>
-                <w:bottom w:val="none" w:sz="0" w:space="0" w:color="000000"/>
-                <w:top w:val="none" w:sz="0" w:space="0" w:color="000000"/>
-                <w:left w:val="none" w:sz="0" w:space="0" w:color="000000"/>
-                <w:right w:val="none" w:sz="0" w:space="0" w:color="000000"/>
-              </w:pBdr>
-              <w:spacing w:after="40" w:before="40" w:line="240"/>
-              <w:ind w:left="100" w:right="100" w:firstLine="0" w:firstLineChars="0"/>
-              <w:rPr>
-                <w:rFonts w:ascii="Times New Roman" w:hAnsi="Helvetica" w:eastAsia="Helvetica" w:cs="Helvetica"/>
-                <w:i w:val="false"/>
-                <w:b w:val="false"/>
-                <w:u w:val="none"/>
-                <w:strike w:val="false"/>
-                <w:sz w:val="20"/>
-                <w:szCs w:val="20"/>
-                <w:color w:val="000000"/>
-              </w:rPr>
-            </w:pPr>
-          </w:p>
-        </w:tc>
-        <w:tc>
-          <w:tcPr>
-            <w:tcBorders>
-              <w:bottom w:val="none" w:sz="0" w:space="0" w:color="000000"/>
-              <w:top w:val="none" w:sz="0" w:space="0" w:color="000000"/>
-              <w:left w:val="none" w:sz="0" w:space="0" w:color="000000"/>
-              <w:right w:val="none" w:sz="0" w:space="0" w:color="000000"/>
-            </w:tcBorders>
-            <w:shd w:val="clear" w:color="auto" w:fill="FFFFFF"/>
-            <w:tcMar>
-              <w:top w:w="0" w:type="dxa"/>
-              <w:bottom w:w="0" w:type="dxa"/>
-              <w:left w:w="0" w:type="dxa"/>
-              <w:right w:w="0" w:type="dxa"/>
-            </w:tcMar>
-            <w:vAlign w:val="center"/>
-          </w:tcPr>
-          <w:p>
-            <w:pPr>
-              <w:pStyle w:val="Normal"/>
-              <w:jc w:val="left"/>
-              <w:keepNext/>
-              <w:pBdr>
-                <w:bottom w:val="none" w:sz="0" w:space="0" w:color="000000"/>
-                <w:top w:val="none" w:sz="0" w:space="0" w:color="000000"/>
-                <w:left w:val="none" w:sz="0" w:space="0" w:color="000000"/>
-                <w:right w:val="none" w:sz="0" w:space="0" w:color="000000"/>
-              </w:pBdr>
-              <w:spacing w:after="40" w:before="40" w:line="240"/>
-              <w:ind w:left="100" w:right="100" w:firstLine="0" w:firstLineChars="0"/>
-              <w:rPr>
-                <w:rFonts w:ascii="Times New Roman" w:hAnsi="Helvetica" w:eastAsia="Helvetica" w:cs="Helvetica"/>
-                <w:i w:val="false"/>
-                <w:b w:val="false"/>
-                <w:u w:val="none"/>
-                <w:strike w:val="false"/>
-                <w:sz w:val="20"/>
-                <w:szCs w:val="20"/>
-                <w:color w:val="000000"/>
-              </w:rPr>
-            </w:pPr>
-            <w:r>
-              <w:rPr>
-                <w:rFonts w:ascii="Times New Roman" w:hAnsi="Helvetica" w:eastAsia="Helvetica" w:cs="Helvetica"/>
-                <w:i w:val="false"/>
-                <w:b w:val="false"/>
-                <w:u w:val="none"/>
-                <w:strike w:val="false"/>
-                <w:sz w:val="20"/>
-                <w:szCs w:val="20"/>
-                <w:color w:val="000000"/>
-              </w:rPr>
-              <w:t xml:space="preserve">Plant Native Grasses and Forbs</w:t>
-            </w:r>
-          </w:p>
-        </w:tc>
-        <w:tc>
-          <w:tcPr>
-            <w:tcBorders>
-              <w:bottom w:val="none" w:sz="0" w:space="0" w:color="000000"/>
-              <w:top w:val="none" w:sz="0" w:space="0" w:color="000000"/>
-              <w:left w:val="none" w:sz="0" w:space="0" w:color="000000"/>
-              <w:right w:val="none" w:sz="0" w:space="0" w:color="000000"/>
-            </w:tcBorders>
-            <w:shd w:val="clear" w:color="auto" w:fill="FFFFFF"/>
-            <w:tcMar>
-              <w:top w:w="0" w:type="dxa"/>
-              <w:bottom w:w="0" w:type="dxa"/>
-              <w:left w:w="0" w:type="dxa"/>
-              <w:right w:w="0" w:type="dxa"/>
-            </w:tcMar>
-            <w:vAlign w:val="center"/>
-          </w:tcPr>
-          <w:p>
-            <w:pPr>
-              <w:pStyle w:val="Normal"/>
-              <w:jc w:val="center"/>
-              <w:keepNext/>
-              <w:pBdr>
-                <w:bottom w:val="none" w:sz="0" w:space="0" w:color="000000"/>
-                <w:top w:val="none" w:sz="0" w:space="0" w:color="000000"/>
-                <w:left w:val="none" w:sz="0" w:space="0" w:color="000000"/>
-                <w:right w:val="none" w:sz="0" w:space="0" w:color="000000"/>
-              </w:pBdr>
-              <w:spacing w:after="40" w:before="40" w:line="240"/>
-              <w:ind w:left="100" w:right="100" w:firstLine="0" w:firstLineChars="0"/>
-              <w:rPr>
-                <w:rFonts w:ascii="Times New Roman" w:hAnsi="Helvetica" w:eastAsia="Helvetica" w:cs="Helvetica"/>
-                <w:i w:val="false"/>
-                <w:b w:val="false"/>
-                <w:u w:val="none"/>
-                <w:strike w:val="false"/>
-                <w:sz w:val="20"/>
-                <w:szCs w:val="20"/>
-                <w:color w:val="000000"/>
-              </w:rPr>
-            </w:pPr>
-            <w:r>
-              <w:rPr>
-                <w:rFonts w:ascii="Times New Roman" w:hAnsi="Helvetica" w:eastAsia="Helvetica" w:cs="Helvetica"/>
-                <w:i w:val="false"/>
-                <w:b w:val="false"/>
-                <w:u w:val="none"/>
-                <w:strike w:val="false"/>
-                <w:sz w:val="20"/>
-                <w:szCs w:val="20"/>
-                <w:color w:val="000000"/>
-              </w:rPr>
-              <w:t xml:space="preserve">16</w:t>
-            </w:r>
-          </w:p>
-        </w:tc>
-        <w:tc>
-          <w:tcPr>
-            <w:tcBorders>
-              <w:bottom w:val="none" w:sz="0" w:space="0" w:color="000000"/>
-              <w:top w:val="none" w:sz="0" w:space="0" w:color="000000"/>
-              <w:left w:val="none" w:sz="0" w:space="0" w:color="000000"/>
-              <w:right w:val="none" w:sz="0" w:space="0" w:color="000000"/>
-            </w:tcBorders>
-            <w:shd w:val="clear" w:color="auto" w:fill="FFFFFF"/>
-            <w:tcMar>
-              <w:top w:w="0" w:type="dxa"/>
-              <w:bottom w:w="0" w:type="dxa"/>
-              <w:left w:w="0" w:type="dxa"/>
-              <w:right w:w="0" w:type="dxa"/>
-            </w:tcMar>
-            <w:vAlign w:val="center"/>
-          </w:tcPr>
-          <w:p>
-            <w:pPr>
-              <w:pStyle w:val="Normal"/>
-              <w:jc w:val="center"/>
-              <w:keepNext/>
-              <w:pBdr>
-                <w:bottom w:val="none" w:sz="0" w:space="0" w:color="000000"/>
-                <w:top w:val="none" w:sz="0" w:space="0" w:color="000000"/>
-                <w:left w:val="none" w:sz="0" w:space="0" w:color="000000"/>
-                <w:right w:val="none" w:sz="0" w:space="0" w:color="000000"/>
-              </w:pBdr>
-              <w:spacing w:after="40" w:before="40" w:line="240"/>
-              <w:ind w:left="100" w:right="100" w:firstLine="0" w:firstLineChars="0"/>
-              <w:rPr>
-                <w:rFonts w:ascii="Times New Roman" w:hAnsi="Helvetica" w:eastAsia="Helvetica" w:cs="Helvetica"/>
-                <w:i w:val="false"/>
-                <w:b w:val="false"/>
-                <w:u w:val="none"/>
-                <w:strike w:val="false"/>
-                <w:sz w:val="20"/>
-                <w:szCs w:val="20"/>
-                <w:color w:val="000000"/>
-              </w:rPr>
-            </w:pPr>
-            <w:r>
-              <w:rPr>
-                <w:rFonts w:ascii="Times New Roman" w:hAnsi="Helvetica" w:eastAsia="Helvetica" w:cs="Helvetica"/>
-                <w:i w:val="false"/>
-                <w:b w:val="false"/>
-                <w:u w:val="none"/>
-                <w:strike w:val="false"/>
-                <w:sz w:val="20"/>
-                <w:szCs w:val="20"/>
-                <w:color w:val="000000"/>
-              </w:rPr>
-              <w:t xml:space="preserve">4</w:t>
-            </w:r>
-          </w:p>
-        </w:tc>
-        <w:tc>
-          <w:tcPr>
-            <w:tcBorders>
-              <w:bottom w:val="none" w:sz="0" w:space="0" w:color="000000"/>
-              <w:top w:val="none" w:sz="0" w:space="0" w:color="000000"/>
-              <w:left w:val="none" w:sz="0" w:space="0" w:color="000000"/>
-              <w:right w:val="none" w:sz="0" w:space="0" w:color="000000"/>
-            </w:tcBorders>
-            <w:shd w:val="clear" w:color="auto" w:fill="FFFFFF"/>
-            <w:tcMar>
-              <w:top w:w="0" w:type="dxa"/>
-              <w:bottom w:w="0" w:type="dxa"/>
-              <w:left w:w="0" w:type="dxa"/>
-              <w:right w:w="0" w:type="dxa"/>
-            </w:tcMar>
-            <w:vAlign w:val="center"/>
-          </w:tcPr>
-          <w:p>
-            <w:pPr>
-              <w:pStyle w:val="Normal"/>
-              <w:jc w:val="center"/>
-              <w:keepNext/>
-              <w:pBdr>
-                <w:bottom w:val="none" w:sz="0" w:space="0" w:color="000000"/>
-                <w:top w:val="none" w:sz="0" w:space="0" w:color="000000"/>
-                <w:left w:val="none" w:sz="0" w:space="0" w:color="000000"/>
-                <w:right w:val="none" w:sz="0" w:space="0" w:color="000000"/>
-              </w:pBdr>
-              <w:spacing w:after="40" w:before="40" w:line="240"/>
-              <w:ind w:left="100" w:right="100" w:firstLine="0" w:firstLineChars="0"/>
-              <w:rPr>
-                <w:rFonts w:ascii="Times New Roman" w:hAnsi="Helvetica" w:eastAsia="Helvetica" w:cs="Helvetica"/>
-                <w:i w:val="false"/>
-                <w:b w:val="false"/>
-                <w:u w:val="none"/>
-                <w:strike w:val="false"/>
-                <w:sz w:val="20"/>
-                <w:szCs w:val="20"/>
-                <w:color w:val="000000"/>
-              </w:rPr>
-            </w:pPr>
-            <w:r>
-              <w:rPr>
-                <w:rFonts w:ascii="Times New Roman" w:hAnsi="Helvetica" w:eastAsia="Helvetica" w:cs="Helvetica"/>
-                <w:i w:val="false"/>
-                <w:b w:val="false"/>
-                <w:u w:val="none"/>
-                <w:strike w:val="false"/>
-                <w:sz w:val="20"/>
-                <w:szCs w:val="20"/>
-                <w:color w:val="000000"/>
-              </w:rPr>
-              <w:t xml:space="preserve">0.18 (-0.32, 0.66)</w:t>
-            </w:r>
-          </w:p>
-        </w:tc>
-        <w:tc>
-          <w:tcPr>
-            <w:tcBorders>
-              <w:bottom w:val="none" w:sz="0" w:space="0" w:color="000000"/>
-              <w:top w:val="none" w:sz="0" w:space="0" w:color="000000"/>
-              <w:left w:val="none" w:sz="0" w:space="0" w:color="000000"/>
-              <w:right w:val="none" w:sz="0" w:space="0" w:color="000000"/>
-            </w:tcBorders>
-            <w:shd w:val="clear" w:color="auto" w:fill="FFFFFF"/>
-            <w:tcMar>
-              <w:top w:w="0" w:type="dxa"/>
-              <w:bottom w:w="0" w:type="dxa"/>
-              <w:left w:w="0" w:type="dxa"/>
-              <w:right w:w="0" w:type="dxa"/>
-            </w:tcMar>
-            <w:vAlign w:val="center"/>
-          </w:tcPr>
-          <w:p>
-            <w:pPr>
-              <w:pStyle w:val="Normal"/>
-              <w:jc w:val="center"/>
-              <w:keepNext/>
-              <w:pBdr>
-                <w:bottom w:val="none" w:sz="0" w:space="0" w:color="000000"/>
-                <w:top w:val="none" w:sz="0" w:space="0" w:color="000000"/>
-                <w:left w:val="none" w:sz="0" w:space="0" w:color="000000"/>
-                <w:right w:val="none" w:sz="0" w:space="0" w:color="000000"/>
-              </w:pBdr>
-              <w:spacing w:after="40" w:before="40" w:line="240"/>
-              <w:ind w:left="100" w:right="100" w:firstLine="0" w:firstLineChars="0"/>
-              <w:rPr>
-                <w:rFonts w:ascii="Times New Roman" w:hAnsi="Helvetica" w:eastAsia="Helvetica" w:cs="Helvetica"/>
-                <w:i w:val="false"/>
-                <w:b w:val="false"/>
-                <w:u w:val="none"/>
-                <w:strike w:val="false"/>
-                <w:sz w:val="20"/>
-                <w:szCs w:val="20"/>
-                <w:color w:val="000000"/>
-              </w:rPr>
-            </w:pPr>
-            <w:r>
-              <w:rPr>
-                <w:rFonts w:ascii="Times New Roman" w:hAnsi="Helvetica" w:eastAsia="Helvetica" w:cs="Helvetica"/>
-                <w:i w:val="false"/>
-                <w:b w:val="false"/>
-                <w:u w:val="none"/>
-                <w:strike w:val="false"/>
-                <w:sz w:val="20"/>
-                <w:szCs w:val="20"/>
-                <w:color w:val="000000"/>
-              </w:rPr>
-              <w:t xml:space="preserve">0.791</w:t>
-            </w:r>
-          </w:p>
-        </w:tc>
-      </w:tr>
-      <w:tr>
-        <w:trPr>
-          <w:cantSplit/>
-          <w:trHeight w:val="623" w:hRule="auto"/>
-        </w:trPr>
-        <w:tc>
-          <w:tcPr>
-            <w:vMerge/>
-            <w:tcBorders>
-              <w:bottom w:val="single" w:sz="4" w:space="0" w:color="666666"/>
-              <w:top w:val="none" w:sz="0" w:space="0" w:color="000000"/>
-              <w:left w:val="none" w:sz="0" w:space="0" w:color="000000"/>
-              <w:right w:val="none" w:sz="0" w:space="0" w:color="000000"/>
-            </w:tcBorders>
-            <w:shd w:val="clear" w:color="auto" w:fill="FFFFFF"/>
-            <w:tcMar>
-              <w:top w:w="0" w:type="dxa"/>
-              <w:bottom w:w="0" w:type="dxa"/>
-              <w:left w:w="0" w:type="dxa"/>
-              <w:right w:w="0" w:type="dxa"/>
-            </w:tcMar>
-            <w:vAlign w:val="center"/>
-          </w:tcPr>
-          <w:p>
-            <w:pPr>
-              <w:pStyle w:val="Normal"/>
-              <w:jc w:val="center"/>
-              <w:keepNext/>
-              <w:pBdr>
-                <w:bottom w:val="none" w:sz="0" w:space="0" w:color="000000"/>
-                <w:top w:val="none" w:sz="0" w:space="0" w:color="000000"/>
-                <w:left w:val="none" w:sz="0" w:space="0" w:color="000000"/>
-                <w:right w:val="none" w:sz="0" w:space="0" w:color="000000"/>
-              </w:pBdr>
-              <w:spacing w:after="40" w:before="40" w:line="240"/>
-              <w:ind w:left="100" w:right="100" w:firstLine="0" w:firstLineChars="0"/>
-              <w:rPr>
-                <w:rFonts w:ascii="Times New Roman" w:hAnsi="Helvetica" w:eastAsia="Helvetica" w:cs="Helvetica"/>
-                <w:i w:val="false"/>
-                <w:b w:val="false"/>
-                <w:u w:val="none"/>
-                <w:strike w:val="false"/>
-                <w:sz w:val="20"/>
-                <w:szCs w:val="20"/>
-                <w:color w:val="000000"/>
-              </w:rPr>
-            </w:pPr>
-          </w:p>
-        </w:tc>
-        <w:tc>
-          <w:tcPr>
-            <w:tcBorders>
-              <w:bottom w:val="single" w:sz="4" w:space="0" w:color="666666"/>
-              <w:top w:val="none" w:sz="0" w:space="0" w:color="000000"/>
-              <w:left w:val="none" w:sz="0" w:space="0" w:color="000000"/>
-              <w:right w:val="none" w:sz="0" w:space="0" w:color="000000"/>
-            </w:tcBorders>
-            <w:shd w:val="clear" w:color="auto" w:fill="FFFFFF"/>
-            <w:tcMar>
-              <w:top w:w="0" w:type="dxa"/>
-              <w:bottom w:w="0" w:type="dxa"/>
-              <w:left w:w="0" w:type="dxa"/>
-              <w:right w:w="0" w:type="dxa"/>
-            </w:tcMar>
-            <w:vAlign w:val="center"/>
-          </w:tcPr>
-          <w:p>
-            <w:pPr>
-              <w:pStyle w:val="Normal"/>
-              <w:jc w:val="left"/>
-              <w:keepNext/>
-              <w:pBdr>
-                <w:bottom w:val="none" w:sz="0" w:space="0" w:color="000000"/>
-                <w:top w:val="none" w:sz="0" w:space="0" w:color="000000"/>
-                <w:left w:val="none" w:sz="0" w:space="0" w:color="000000"/>
-                <w:right w:val="none" w:sz="0" w:space="0" w:color="000000"/>
-              </w:pBdr>
-              <w:spacing w:after="40" w:before="40" w:line="240"/>
-              <w:ind w:left="100" w:right="100" w:firstLine="0" w:firstLineChars="0"/>
-              <w:rPr>
-                <w:rFonts w:ascii="Times New Roman" w:hAnsi="Helvetica" w:eastAsia="Helvetica" w:cs="Helvetica"/>
-                <w:i w:val="false"/>
-                <w:b w:val="false"/>
-                <w:u w:val="none"/>
-                <w:strike w:val="false"/>
-                <w:sz w:val="20"/>
-                <w:szCs w:val="20"/>
-                <w:color w:val="000000"/>
-              </w:rPr>
-            </w:pPr>
-            <w:r>
-              <w:rPr>
-                <w:rFonts w:ascii="Times New Roman" w:hAnsi="Helvetica" w:eastAsia="Helvetica" w:cs="Helvetica"/>
-                <w:i w:val="false"/>
-                <w:b w:val="false"/>
-                <w:u w:val="none"/>
-                <w:strike w:val="false"/>
-                <w:sz w:val="20"/>
-                <w:szCs w:val="20"/>
-                <w:color w:val="000000"/>
-              </w:rPr>
-              <w:t xml:space="preserve">Promote Edge and Shrub Habitat</w:t>
-            </w:r>
-          </w:p>
-        </w:tc>
-        <w:tc>
-          <w:tcPr>
-            <w:tcBorders>
-              <w:bottom w:val="single" w:sz="4" w:space="0" w:color="666666"/>
-              <w:top w:val="none" w:sz="0" w:space="0" w:color="000000"/>
-              <w:left w:val="none" w:sz="0" w:space="0" w:color="000000"/>
-              <w:right w:val="none" w:sz="0" w:space="0" w:color="000000"/>
-            </w:tcBorders>
-            <w:shd w:val="clear" w:color="auto" w:fill="FFFFFF"/>
-            <w:tcMar>
-              <w:top w:w="0" w:type="dxa"/>
-              <w:bottom w:w="0" w:type="dxa"/>
-              <w:left w:w="0" w:type="dxa"/>
-              <w:right w:w="0" w:type="dxa"/>
-            </w:tcMar>
-            <w:vAlign w:val="center"/>
-          </w:tcPr>
-          <w:p>
-            <w:pPr>
-              <w:pStyle w:val="Normal"/>
-              <w:jc w:val="center"/>
-              <w:keepNext/>
-              <w:pBdr>
-                <w:bottom w:val="none" w:sz="0" w:space="0" w:color="000000"/>
-                <w:top w:val="none" w:sz="0" w:space="0" w:color="000000"/>
-                <w:left w:val="none" w:sz="0" w:space="0" w:color="000000"/>
-                <w:right w:val="none" w:sz="0" w:space="0" w:color="000000"/>
-              </w:pBdr>
-              <w:spacing w:after="40" w:before="40" w:line="240"/>
-              <w:ind w:left="100" w:right="100" w:firstLine="0" w:firstLineChars="0"/>
-              <w:rPr>
-                <w:rFonts w:ascii="Times New Roman" w:hAnsi="Helvetica" w:eastAsia="Helvetica" w:cs="Helvetica"/>
-                <w:i w:val="false"/>
-                <w:b w:val="false"/>
-                <w:u w:val="none"/>
-                <w:strike w:val="false"/>
-                <w:sz w:val="20"/>
-                <w:szCs w:val="20"/>
-                <w:color w:val="000000"/>
-              </w:rPr>
-            </w:pPr>
-            <w:r>
-              <w:rPr>
-                <w:rFonts w:ascii="Times New Roman" w:hAnsi="Helvetica" w:eastAsia="Helvetica" w:cs="Helvetica"/>
-                <w:i w:val="false"/>
-                <w:b w:val="false"/>
-                <w:u w:val="none"/>
-                <w:strike w:val="false"/>
-                <w:sz w:val="20"/>
-                <w:szCs w:val="20"/>
-                <w:color w:val="000000"/>
-              </w:rPr>
-              <w:t xml:space="preserve">6</w:t>
-            </w:r>
-          </w:p>
-        </w:tc>
-        <w:tc>
-          <w:tcPr>
-            <w:tcBorders>
-              <w:bottom w:val="single" w:sz="4" w:space="0" w:color="666666"/>
-              <w:top w:val="none" w:sz="0" w:space="0" w:color="000000"/>
-              <w:left w:val="none" w:sz="0" w:space="0" w:color="000000"/>
-              <w:right w:val="none" w:sz="0" w:space="0" w:color="000000"/>
-            </w:tcBorders>
-            <w:shd w:val="clear" w:color="auto" w:fill="FFFFFF"/>
-            <w:tcMar>
-              <w:top w:w="0" w:type="dxa"/>
-              <w:bottom w:w="0" w:type="dxa"/>
-              <w:left w:w="0" w:type="dxa"/>
-              <w:right w:w="0" w:type="dxa"/>
-            </w:tcMar>
-            <w:vAlign w:val="center"/>
-          </w:tcPr>
-          <w:p>
-            <w:pPr>
-              <w:pStyle w:val="Normal"/>
-              <w:jc w:val="center"/>
-              <w:keepNext/>
-              <w:pBdr>
-                <w:bottom w:val="none" w:sz="0" w:space="0" w:color="000000"/>
-                <w:top w:val="none" w:sz="0" w:space="0" w:color="000000"/>
-                <w:left w:val="none" w:sz="0" w:space="0" w:color="000000"/>
-                <w:right w:val="none" w:sz="0" w:space="0" w:color="000000"/>
-              </w:pBdr>
-              <w:spacing w:after="40" w:before="40" w:line="240"/>
-              <w:ind w:left="100" w:right="100" w:firstLine="0" w:firstLineChars="0"/>
-              <w:rPr>
-                <w:rFonts w:ascii="Times New Roman" w:hAnsi="Helvetica" w:eastAsia="Helvetica" w:cs="Helvetica"/>
-                <w:i w:val="false"/>
-                <w:b w:val="false"/>
-                <w:u w:val="none"/>
-                <w:strike w:val="false"/>
-                <w:sz w:val="20"/>
-                <w:szCs w:val="20"/>
-                <w:color w:val="000000"/>
-              </w:rPr>
-            </w:pPr>
-            <w:r>
-              <w:rPr>
-                <w:rFonts w:ascii="Times New Roman" w:hAnsi="Helvetica" w:eastAsia="Helvetica" w:cs="Helvetica"/>
-                <w:i w:val="false"/>
-                <w:b w:val="false"/>
-                <w:u w:val="none"/>
-                <w:strike w:val="false"/>
-                <w:sz w:val="20"/>
-                <w:szCs w:val="20"/>
-                <w:color w:val="000000"/>
-              </w:rPr>
-              <w:t xml:space="preserve">5</w:t>
-            </w:r>
-          </w:p>
-        </w:tc>
-        <w:tc>
-          <w:tcPr>
-            <w:tcBorders>
-              <w:bottom w:val="single" w:sz="4" w:space="0" w:color="666666"/>
-              <w:top w:val="none" w:sz="0" w:space="0" w:color="000000"/>
-              <w:left w:val="none" w:sz="0" w:space="0" w:color="000000"/>
-              <w:right w:val="none" w:sz="0" w:space="0" w:color="000000"/>
-            </w:tcBorders>
-            <w:shd w:val="clear" w:color="auto" w:fill="FFFFFF"/>
-            <w:tcMar>
-              <w:top w:w="0" w:type="dxa"/>
-              <w:bottom w:w="0" w:type="dxa"/>
-              <w:left w:w="0" w:type="dxa"/>
-              <w:right w:w="0" w:type="dxa"/>
-            </w:tcMar>
-            <w:vAlign w:val="center"/>
-          </w:tcPr>
-          <w:p>
-            <w:pPr>
-              <w:pStyle w:val="Normal"/>
-              <w:jc w:val="center"/>
-              <w:keepNext/>
-              <w:pBdr>
-                <w:bottom w:val="none" w:sz="0" w:space="0" w:color="000000"/>
-                <w:top w:val="none" w:sz="0" w:space="0" w:color="000000"/>
-                <w:left w:val="none" w:sz="0" w:space="0" w:color="000000"/>
-                <w:right w:val="none" w:sz="0" w:space="0" w:color="000000"/>
-              </w:pBdr>
-              <w:spacing w:after="40" w:before="40" w:line="240"/>
-              <w:ind w:left="100" w:right="100" w:firstLine="0" w:firstLineChars="0"/>
-              <w:rPr>
-                <w:rFonts w:ascii="Times New Roman" w:hAnsi="Helvetica" w:eastAsia="Helvetica" w:cs="Helvetica"/>
-                <w:i w:val="false"/>
-                <w:b w:val="false"/>
-                <w:u w:val="none"/>
-                <w:strike w:val="false"/>
-                <w:sz w:val="20"/>
-                <w:szCs w:val="20"/>
-                <w:color w:val="000000"/>
-              </w:rPr>
-            </w:pPr>
-            <w:r>
-              <w:rPr>
-                <w:rFonts w:ascii="Times New Roman" w:hAnsi="Helvetica" w:eastAsia="Helvetica" w:cs="Helvetica"/>
-                <w:i w:val="false"/>
-                <w:b w:val="false"/>
-                <w:u w:val="none"/>
-                <w:strike w:val="false"/>
-                <w:sz w:val="20"/>
-                <w:szCs w:val="20"/>
-                <w:color w:val="000000"/>
-              </w:rPr>
-              <w:t xml:space="preserve">-0.44 (-0.96, 0.08)</w:t>
-            </w:r>
-          </w:p>
-        </w:tc>
-        <w:tc>
-          <w:tcPr>
-            <w:tcBorders>
-              <w:bottom w:val="single" w:sz="4" w:space="0" w:color="666666"/>
-              <w:top w:val="none" w:sz="0" w:space="0" w:color="000000"/>
-              <w:left w:val="none" w:sz="0" w:space="0" w:color="000000"/>
-              <w:right w:val="none" w:sz="0" w:space="0" w:color="000000"/>
-            </w:tcBorders>
-            <w:shd w:val="clear" w:color="auto" w:fill="FFFFFF"/>
-            <w:tcMar>
-              <w:top w:w="0" w:type="dxa"/>
-              <w:bottom w:w="0" w:type="dxa"/>
-              <w:left w:w="0" w:type="dxa"/>
-              <w:right w:w="0" w:type="dxa"/>
-            </w:tcMar>
-            <w:vAlign w:val="center"/>
-          </w:tcPr>
-          <w:p>
-            <w:pPr>
-              <w:pStyle w:val="Normal"/>
-              <w:jc w:val="center"/>
-              <w:keepNext/>
-              <w:pBdr>
-                <w:bottom w:val="none" w:sz="0" w:space="0" w:color="000000"/>
-                <w:top w:val="none" w:sz="0" w:space="0" w:color="000000"/>
-                <w:left w:val="none" w:sz="0" w:space="0" w:color="000000"/>
-                <w:right w:val="none" w:sz="0" w:space="0" w:color="000000"/>
-              </w:pBdr>
-              <w:spacing w:after="40" w:before="40" w:line="240"/>
-              <w:ind w:left="100" w:right="100" w:firstLine="0" w:firstLineChars="0"/>
-              <w:rPr>
-                <w:rFonts w:ascii="Times New Roman" w:hAnsi="Helvetica" w:eastAsia="Helvetica" w:cs="Helvetica"/>
-                <w:i w:val="false"/>
-                <w:b w:val="false"/>
-                <w:u w:val="none"/>
-                <w:strike w:val="false"/>
-                <w:sz w:val="20"/>
-                <w:szCs w:val="20"/>
-                <w:color w:val="000000"/>
-              </w:rPr>
-            </w:pPr>
-            <w:r>
-              <w:rPr>
-                <w:rFonts w:ascii="Times New Roman" w:hAnsi="Helvetica" w:eastAsia="Helvetica" w:cs="Helvetica"/>
-                <w:i w:val="false"/>
-                <w:b w:val="false"/>
-                <w:u w:val="none"/>
-                <w:strike w:val="false"/>
-                <w:sz w:val="20"/>
-                <w:szCs w:val="20"/>
-                <w:color w:val="000000"/>
-              </w:rPr>
-              <w:t xml:space="preserve">0.048</w:t>
-            </w:r>
-          </w:p>
-        </w:tc>
-      </w:tr>
-    </w:tbl>
-    <w:p>
-      <w:pPr/>
-      <w:r>
-        <w:br w:type="page"/>
-      </w:r>
-    </w:p>
-    <w:p>
-      <w:pPr>
-        <w:pStyle w:val="TableCaption"/>
-        <w:jc w:val="left"/>
-        <w:keepNext/>
-        <w:pBdr>
-          <w:bottom w:val="none" w:sz="0" w:space="0" w:color="000000"/>
-          <w:top w:val="none" w:sz="0" w:space="0" w:color="000000"/>
-          <w:left w:val="none" w:sz="0" w:space="0" w:color="000000"/>
-          <w:right w:val="none" w:sz="0" w:space="0" w:color="000000"/>
-        </w:pBdr>
-        <w:spacing w:after="60" w:before="60" w:line="240"/>
-        <w:ind w:left="60" w:right="60" w:firstLine="0" w:firstLineChars="0"/>
-      </w:pPr>
-      <w:r>
-        <w:rPr>
-          <w:rFonts w:ascii="Times New Roman" w:hAnsi="Times New Roman" w:eastAsia="Times New Roman" w:cs="Times New Roman"/>
-          <w:i w:val="false"/>
-          <w:b w:val="true"/>
-          <w:u w:val="none"/>
-          <w:strike w:val="false"/>
-          <w:sz w:val="22"/>
-          <w:szCs w:val="22"/>
-          <w:color w:val="000000"/>
-        </w:rPr>
-        <w:t xml:space="preserve">Table S5</w:t>
-      </w:r>
-      <w:r>
-        <w:rPr>
-          <w:rFonts w:ascii="Times New Roman" w:hAnsi="Times New Roman" w:eastAsia="Times New Roman" w:cs="Times New Roman"/>
-          <w:i w:val="false"/>
-          <w:b w:val="false"/>
-          <w:u w:val="none"/>
-          <w:strike w:val="false"/>
-          <w:sz w:val="22"/>
-          <w:szCs w:val="22"/>
-          <w:color w:val="000000"/>
-        </w:rPr>
         <w:t xml:space="preserve">. Direct posterior contrasts between obligate and facultative </w:t>
       </w:r>
       <w:r>
@@ -13935,7 +12153,7 @@
           <w:szCs w:val="22"/>
           <w:color w:val="000000"/>
         </w:rPr>
-        <w:t xml:space="preserve"> for abundance, log hazard ratio for nest survival. A positive </w:t>
+        <w:t xml:space="preserve">. A positive contrast means the practice benefits obligate species </w:t>
       </w:r>
       <w:r>
         <w:rPr>
@@ -13948,7 +12166,7 @@
           <w:szCs w:val="22"/>
           <w:color w:val="000000"/>
         </w:rPr>
-        <w:t xml:space="preserve">contrast means the practice benefits obligate species more than </w:t>
+        <w:t xml:space="preserve">more than facultative species; the final column is the posterior </w:t>
       </w:r>
       <w:r>
         <w:rPr>
@@ -13961,7 +12179,7 @@
           <w:szCs w:val="22"/>
           <w:color w:val="000000"/>
         </w:rPr>
-        <w:t xml:space="preserve">facultative species; the final column is the posterior probability </w:t>
+        <w:t xml:space="preserve">probability of that. These are joint posterior comparisons, not </w:t>
       </w:r>
       <w:r>
         <w:rPr>
@@ -13974,20 +12192,7 @@
           <w:szCs w:val="22"/>
           <w:color w:val="000000"/>
         </w:rPr>
-        <w:t xml:space="preserve">of that. These are joint posterior comparisons, not inferences from </w:t>
-      </w:r>
-      <w:r>
-        <w:rPr>
-          <w:rFonts w:ascii="Times New Roman" w:hAnsi="Times New Roman" w:eastAsia="Times New Roman" w:cs="Times New Roman"/>
-          <w:i w:val="false"/>
-          <w:b w:val="false"/>
-          <w:u w:val="none"/>
-          <w:strike w:val="false"/>
-          <w:sz w:val="22"/>
-          <w:szCs w:val="22"/>
-          <w:color w:val="000000"/>
-        </w:rPr>
-        <w:t xml:space="preserve">whether two intervals overlap. </w:t>
+        <w:t xml:space="preserve">inferences from whether two intervals overlap. </w:t>
       </w:r>
       <w:r>
         <w:rPr>
@@ -14036,62 +12241,6 @@
           <w:p>
             <w:pPr>
               <w:pStyle w:val="Normal"/>
-              <w:jc w:val="center"/>
-              <w:keepNext/>
-              <w:pBdr>
-                <w:bottom w:val="none" w:sz="0" w:space="0" w:color="000000"/>
-                <w:top w:val="none" w:sz="0" w:space="0" w:color="000000"/>
-                <w:left w:val="none" w:sz="0" w:space="0" w:color="000000"/>
-                <w:right w:val="none" w:sz="0" w:space="0" w:color="000000"/>
-              </w:pBdr>
-              <w:spacing w:after="40" w:before="40" w:line="240"/>
-              <w:ind w:left="100" w:right="100" w:firstLine="0" w:firstLineChars="0"/>
-              <w:rPr>
-                <w:rFonts w:ascii="Times New Roman" w:hAnsi="Helvetica" w:eastAsia="Helvetica" w:cs="Helvetica"/>
-                <w:i w:val="false"/>
-                <w:b w:val="false"/>
-                <w:u w:val="none"/>
-                <w:strike w:val="false"/>
-                <w:sz w:val="22"/>
-                <w:szCs w:val="22"/>
-                <w:color w:val="000000"/>
-              </w:rPr>
-            </w:pPr>
-            <w:r>
-              <w:rPr>
-                <w:rFonts w:ascii="Times New Roman" w:hAnsi="Helvetica" w:eastAsia="Helvetica" w:cs="Helvetica"/>
-                <w:i w:val="false"/>
-                <w:b w:val="false"/>
-                <w:u w:val="none"/>
-                <w:strike w:val="false"/>
-                <w:sz w:val="22"/>
-                <w:szCs w:val="22"/>
-                <w:color w:val="000000"/>
-              </w:rPr>
-              <w:t xml:space="preserve">Response</w:t>
-            </w:r>
-          </w:p>
-        </w:tc>
-        <w:tc>
-          <w:tcPr>
-            <w:tcBorders>
-              <w:bottom w:val="single" w:sz="12" w:space="0" w:color="666666"/>
-              <w:top w:val="single" w:sz="12" w:space="0" w:color="666666"/>
-              <w:left w:val="none" w:sz="0" w:space="0" w:color="000000"/>
-              <w:right w:val="none" w:sz="0" w:space="0" w:color="000000"/>
-            </w:tcBorders>
-            <w:shd w:val="clear" w:color="auto" w:fill="FFFFFF"/>
-            <w:tcMar>
-              <w:top w:w="0" w:type="dxa"/>
-              <w:bottom w:w="0" w:type="dxa"/>
-              <w:left w:w="0" w:type="dxa"/>
-              <w:right w:w="0" w:type="dxa"/>
-            </w:tcMar>
-            <w:vAlign w:val="center"/>
-          </w:tcPr>
-          <w:p>
-            <w:pPr>
-              <w:pStyle w:val="Normal"/>
               <w:jc w:val="left"/>
               <w:keepNext/>
               <w:pBdr>
@@ -14248,63 +12397,6 @@
         </w:trPr>
         <w:tc>
           <w:tcPr>
-            <w:vMerge w:val="restart"/>
-            <w:tcBorders>
-              <w:bottom w:val="single" w:sz="4" w:space="0" w:color="666666"/>
-              <w:top w:val="single" w:sz="12" w:space="0" w:color="666666"/>
-              <w:left w:val="none" w:sz="0" w:space="0" w:color="000000"/>
-              <w:right w:val="none" w:sz="0" w:space="0" w:color="000000"/>
-            </w:tcBorders>
-            <w:shd w:val="clear" w:color="auto" w:fill="FFFFFF"/>
-            <w:tcMar>
-              <w:top w:w="0" w:type="dxa"/>
-              <w:bottom w:w="0" w:type="dxa"/>
-              <w:left w:w="0" w:type="dxa"/>
-              <w:right w:w="0" w:type="dxa"/>
-            </w:tcMar>
-            <w:vAlign w:val="center"/>
-          </w:tcPr>
-          <w:p>
-            <w:pPr>
-              <w:pStyle w:val="Normal"/>
-              <w:jc w:val="center"/>
-              <w:keepNext/>
-              <w:pBdr>
-                <w:bottom w:val="none" w:sz="0" w:space="0" w:color="000000"/>
-                <w:top w:val="none" w:sz="0" w:space="0" w:color="000000"/>
-                <w:left w:val="none" w:sz="0" w:space="0" w:color="000000"/>
-                <w:right w:val="none" w:sz="0" w:space="0" w:color="000000"/>
-              </w:pBdr>
-              <w:spacing w:after="40" w:before="40" w:line="240"/>
-              <w:ind w:left="100" w:right="100" w:firstLine="0" w:firstLineChars="0"/>
-              <w:rPr>
-                <w:rFonts w:ascii="Times New Roman" w:hAnsi="Helvetica" w:eastAsia="Helvetica" w:cs="Helvetica"/>
-                <w:i w:val="false"/>
-                <w:b w:val="true"/>
-                <w:u w:val="none"/>
-                <w:strike w:val="false"/>
-                <w:sz w:val="20"/>
-                <w:szCs w:val="20"/>
-                <w:color w:val="000000"/>
-              </w:rPr>
-            </w:pPr>
-            <w:r>
-              <w:rPr>
-                <w:rFonts w:ascii="Times New Roman" w:hAnsi="Helvetica" w:eastAsia="Helvetica" w:cs="Helvetica"/>
-                <w:i w:val="false"/>
-                <w:b w:val="true"/>
-                <w:u w:val="none"/>
-                <w:strike w:val="false"/>
-                <w:sz w:val="20"/>
-                <w:szCs w:val="20"/>
-                <w:color w:val="000000"/>
-              </w:rPr>
-              <w:t xml:space="preserve">Abundance</w:t>
-            </w:r>
-          </w:p>
-        </w:tc>
-        <w:tc>
-          <w:tcPr>
             <w:tcBorders>
               <w:bottom w:val="none" w:sz="0" w:space="0" w:color="000000"/>
               <w:top w:val="single" w:sz="12" w:space="0" w:color="666666"/>
@@ -14479,50 +12571,6 @@
         </w:trPr>
         <w:tc>
           <w:tcPr>
-            <w:vMerge/>
-            <w:tcBorders>
-              <w:bottom w:val="none" w:sz="0" w:space="0" w:color="000000"/>
-              <w:top w:val="single" w:sz="4" w:space="0" w:color="666666"/>
-              <w:left w:val="none" w:sz="0" w:space="0" w:color="000000"/>
-              <w:right w:val="none" w:sz="0" w:space="0" w:color="000000"/>
-            </w:tcBorders>
-            <w:shd w:val="clear" w:color="auto" w:fill="FFFFFF"/>
-            <w:tcMar>
-              <w:top w:w="0" w:type="dxa"/>
-              <w:bottom w:w="0" w:type="dxa"/>
-              <w:left w:w="0" w:type="dxa"/>
-              <w:right w:w="0" w:type="dxa"/>
-            </w:tcMar>
-            <w:vAlign w:val="center"/>
-          </w:tcPr>
-          <w:p>
-            <w:pPr>
-              <w:pStyle w:val="Normal"/>
-              <w:jc w:val="center"/>
-              <w:keepNext/>
-              <w:pBdr>
-                <w:bottom w:val="none" w:sz="0" w:space="0" w:color="000000"/>
-                <w:top w:val="none" w:sz="0" w:space="0" w:color="000000"/>
-                <w:left w:val="none" w:sz="0" w:space="0" w:color="000000"/>
-                <w:right w:val="none" w:sz="0" w:space="0" w:color="000000"/>
-              </w:pBdr>
-              <w:spacing w:after="40" w:before="40" w:line="240"/>
-              <w:ind w:left="100" w:right="100" w:firstLine="0" w:firstLineChars="0"/>
-              <w:rPr>
-                <w:rFonts w:ascii="Times New Roman" w:hAnsi="Helvetica" w:eastAsia="Helvetica" w:cs="Helvetica"/>
-                <w:i w:val="false"/>
-                <w:b w:val="true"/>
-                <w:u w:val="none"/>
-                <w:strike w:val="false"/>
-                <w:sz w:val="20"/>
-                <w:szCs w:val="20"/>
-                <w:color w:val="000000"/>
-              </w:rPr>
-            </w:pPr>
-          </w:p>
-        </w:tc>
-        <w:tc>
-          <w:tcPr>
             <w:tcBorders>
               <w:bottom w:val="none" w:sz="0" w:space="0" w:color="000000"/>
               <w:top w:val="none" w:sz="0" w:space="0" w:color="000000"/>
@@ -14697,50 +12745,6 @@
         </w:trPr>
         <w:tc>
           <w:tcPr>
-            <w:vMerge/>
-            <w:tcBorders>
-              <w:bottom w:val="none" w:sz="0" w:space="0" w:color="000000"/>
-              <w:top w:val="none" w:sz="0" w:space="0" w:color="000000"/>
-              <w:left w:val="none" w:sz="0" w:space="0" w:color="000000"/>
-              <w:right w:val="none" w:sz="0" w:space="0" w:color="000000"/>
-            </w:tcBorders>
-            <w:shd w:val="clear" w:color="auto" w:fill="FFFFFF"/>
-            <w:tcMar>
-              <w:top w:w="0" w:type="dxa"/>
-              <w:bottom w:w="0" w:type="dxa"/>
-              <w:left w:w="0" w:type="dxa"/>
-              <w:right w:w="0" w:type="dxa"/>
-            </w:tcMar>
-            <w:vAlign w:val="center"/>
-          </w:tcPr>
-          <w:p>
-            <w:pPr>
-              <w:pStyle w:val="Normal"/>
-              <w:jc w:val="center"/>
-              <w:keepNext/>
-              <w:pBdr>
-                <w:bottom w:val="none" w:sz="0" w:space="0" w:color="000000"/>
-                <w:top w:val="none" w:sz="0" w:space="0" w:color="000000"/>
-                <w:left w:val="none" w:sz="0" w:space="0" w:color="000000"/>
-                <w:right w:val="none" w:sz="0" w:space="0" w:color="000000"/>
-              </w:pBdr>
-              <w:spacing w:after="40" w:before="40" w:line="240"/>
-              <w:ind w:left="100" w:right="100" w:firstLine="0" w:firstLineChars="0"/>
-              <w:rPr>
-                <w:rFonts w:ascii="Times New Roman" w:hAnsi="Helvetica" w:eastAsia="Helvetica" w:cs="Helvetica"/>
-                <w:i w:val="false"/>
-                <w:b w:val="false"/>
-                <w:u w:val="none"/>
-                <w:strike w:val="false"/>
-                <w:sz w:val="20"/>
-                <w:szCs w:val="20"/>
-                <w:color w:val="000000"/>
-              </w:rPr>
-            </w:pPr>
-          </w:p>
-        </w:tc>
-        <w:tc>
-          <w:tcPr>
             <w:tcBorders>
               <w:bottom w:val="none" w:sz="0" w:space="0" w:color="000000"/>
               <w:top w:val="none" w:sz="0" w:space="0" w:color="000000"/>
@@ -14915,50 +12919,6 @@
         </w:trPr>
         <w:tc>
           <w:tcPr>
-            <w:vMerge/>
-            <w:tcBorders>
-              <w:bottom w:val="none" w:sz="0" w:space="0" w:color="000000"/>
-              <w:top w:val="none" w:sz="0" w:space="0" w:color="000000"/>
-              <w:left w:val="none" w:sz="0" w:space="0" w:color="000000"/>
-              <w:right w:val="none" w:sz="0" w:space="0" w:color="000000"/>
-            </w:tcBorders>
-            <w:shd w:val="clear" w:color="auto" w:fill="FFFFFF"/>
-            <w:tcMar>
-              <w:top w:w="0" w:type="dxa"/>
-              <w:bottom w:w="0" w:type="dxa"/>
-              <w:left w:w="0" w:type="dxa"/>
-              <w:right w:w="0" w:type="dxa"/>
-            </w:tcMar>
-            <w:vAlign w:val="center"/>
-          </w:tcPr>
-          <w:p>
-            <w:pPr>
-              <w:pStyle w:val="Normal"/>
-              <w:jc w:val="center"/>
-              <w:keepNext/>
-              <w:pBdr>
-                <w:bottom w:val="none" w:sz="0" w:space="0" w:color="000000"/>
-                <w:top w:val="none" w:sz="0" w:space="0" w:color="000000"/>
-                <w:left w:val="none" w:sz="0" w:space="0" w:color="000000"/>
-                <w:right w:val="none" w:sz="0" w:space="0" w:color="000000"/>
-              </w:pBdr>
-              <w:spacing w:after="40" w:before="40" w:line="240"/>
-              <w:ind w:left="100" w:right="100" w:firstLine="0" w:firstLineChars="0"/>
-              <w:rPr>
-                <w:rFonts w:ascii="Times New Roman" w:hAnsi="Helvetica" w:eastAsia="Helvetica" w:cs="Helvetica"/>
-                <w:i w:val="false"/>
-                <w:b w:val="false"/>
-                <w:u w:val="none"/>
-                <w:strike w:val="false"/>
-                <w:sz w:val="20"/>
-                <w:szCs w:val="20"/>
-                <w:color w:val="000000"/>
-              </w:rPr>
-            </w:pPr>
-          </w:p>
-        </w:tc>
-        <w:tc>
-          <w:tcPr>
             <w:tcBorders>
               <w:bottom w:val="none" w:sz="0" w:space="0" w:color="000000"/>
               <w:top w:val="none" w:sz="0" w:space="0" w:color="000000"/>
@@ -15133,50 +13093,6 @@
         </w:trPr>
         <w:tc>
           <w:tcPr>
-            <w:vMerge/>
-            <w:tcBorders>
-              <w:bottom w:val="none" w:sz="0" w:space="0" w:color="000000"/>
-              <w:top w:val="none" w:sz="0" w:space="0" w:color="000000"/>
-              <w:left w:val="none" w:sz="0" w:space="0" w:color="000000"/>
-              <w:right w:val="none" w:sz="0" w:space="0" w:color="000000"/>
-            </w:tcBorders>
-            <w:shd w:val="clear" w:color="auto" w:fill="FFFFFF"/>
-            <w:tcMar>
-              <w:top w:w="0" w:type="dxa"/>
-              <w:bottom w:w="0" w:type="dxa"/>
-              <w:left w:w="0" w:type="dxa"/>
-              <w:right w:w="0" w:type="dxa"/>
-            </w:tcMar>
-            <w:vAlign w:val="center"/>
-          </w:tcPr>
-          <w:p>
-            <w:pPr>
-              <w:pStyle w:val="Normal"/>
-              <w:jc w:val="center"/>
-              <w:keepNext/>
-              <w:pBdr>
-                <w:bottom w:val="none" w:sz="0" w:space="0" w:color="000000"/>
-                <w:top w:val="none" w:sz="0" w:space="0" w:color="000000"/>
-                <w:left w:val="none" w:sz="0" w:space="0" w:color="000000"/>
-                <w:right w:val="none" w:sz="0" w:space="0" w:color="000000"/>
-              </w:pBdr>
-              <w:spacing w:after="40" w:before="40" w:line="240"/>
-              <w:ind w:left="100" w:right="100" w:firstLine="0" w:firstLineChars="0"/>
-              <w:rPr>
-                <w:rFonts w:ascii="Times New Roman" w:hAnsi="Helvetica" w:eastAsia="Helvetica" w:cs="Helvetica"/>
-                <w:i w:val="false"/>
-                <w:b w:val="false"/>
-                <w:u w:val="none"/>
-                <w:strike w:val="false"/>
-                <w:sz w:val="20"/>
-                <w:szCs w:val="20"/>
-                <w:color w:val="000000"/>
-              </w:rPr>
-            </w:pPr>
-          </w:p>
-        </w:tc>
-        <w:tc>
-          <w:tcPr>
             <w:tcBorders>
               <w:bottom w:val="none" w:sz="0" w:space="0" w:color="000000"/>
               <w:top w:val="none" w:sz="0" w:space="0" w:color="000000"/>
@@ -15351,50 +13267,6 @@
         </w:trPr>
         <w:tc>
           <w:tcPr>
-            <w:vMerge/>
-            <w:tcBorders>
-              <w:bottom w:val="none" w:sz="0" w:space="0" w:color="000000"/>
-              <w:top w:val="none" w:sz="0" w:space="0" w:color="000000"/>
-              <w:left w:val="none" w:sz="0" w:space="0" w:color="000000"/>
-              <w:right w:val="none" w:sz="0" w:space="0" w:color="000000"/>
-            </w:tcBorders>
-            <w:shd w:val="clear" w:color="auto" w:fill="FFFFFF"/>
-            <w:tcMar>
-              <w:top w:w="0" w:type="dxa"/>
-              <w:bottom w:w="0" w:type="dxa"/>
-              <w:left w:w="0" w:type="dxa"/>
-              <w:right w:w="0" w:type="dxa"/>
-            </w:tcMar>
-            <w:vAlign w:val="center"/>
-          </w:tcPr>
-          <w:p>
-            <w:pPr>
-              <w:pStyle w:val="Normal"/>
-              <w:jc w:val="center"/>
-              <w:keepNext/>
-              <w:pBdr>
-                <w:bottom w:val="none" w:sz="0" w:space="0" w:color="000000"/>
-                <w:top w:val="none" w:sz="0" w:space="0" w:color="000000"/>
-                <w:left w:val="none" w:sz="0" w:space="0" w:color="000000"/>
-                <w:right w:val="none" w:sz="0" w:space="0" w:color="000000"/>
-              </w:pBdr>
-              <w:spacing w:after="40" w:before="40" w:line="240"/>
-              <w:ind w:left="100" w:right="100" w:firstLine="0" w:firstLineChars="0"/>
-              <w:rPr>
-                <w:rFonts w:ascii="Times New Roman" w:hAnsi="Helvetica" w:eastAsia="Helvetica" w:cs="Helvetica"/>
-                <w:i w:val="false"/>
-                <w:b w:val="false"/>
-                <w:u w:val="none"/>
-                <w:strike w:val="false"/>
-                <w:sz w:val="20"/>
-                <w:szCs w:val="20"/>
-                <w:color w:val="000000"/>
-              </w:rPr>
-            </w:pPr>
-          </w:p>
-        </w:tc>
-        <w:tc>
-          <w:tcPr>
             <w:tcBorders>
               <w:bottom w:val="none" w:sz="0" w:space="0" w:color="000000"/>
               <w:top w:val="none" w:sz="0" w:space="0" w:color="000000"/>
@@ -15558,224 +13430,6 @@
                 <w:color w:val="000000"/>
               </w:rPr>
               <w:t xml:space="preserve">0.082</w:t>
-            </w:r>
-          </w:p>
-        </w:tc>
-      </w:tr>
-      <w:tr>
-        <w:trPr>
-          <w:cantSplit/>
-          <w:trHeight w:val="608" w:hRule="auto"/>
-        </w:trPr>
-        <w:tc>
-          <w:tcPr>
-            <w:vMerge/>
-            <w:tcBorders>
-              <w:bottom w:val="single" w:sz="4" w:space="0" w:color="666666"/>
-              <w:top w:val="none" w:sz="0" w:space="0" w:color="000000"/>
-              <w:left w:val="none" w:sz="0" w:space="0" w:color="000000"/>
-              <w:right w:val="none" w:sz="0" w:space="0" w:color="000000"/>
-            </w:tcBorders>
-            <w:shd w:val="clear" w:color="auto" w:fill="FFFFFF"/>
-            <w:tcMar>
-              <w:top w:w="0" w:type="dxa"/>
-              <w:bottom w:w="0" w:type="dxa"/>
-              <w:left w:w="0" w:type="dxa"/>
-              <w:right w:w="0" w:type="dxa"/>
-            </w:tcMar>
-            <w:vAlign w:val="center"/>
-          </w:tcPr>
-          <w:p>
-            <w:pPr>
-              <w:pStyle w:val="Normal"/>
-              <w:jc w:val="center"/>
-              <w:keepNext/>
-              <w:pBdr>
-                <w:bottom w:val="none" w:sz="0" w:space="0" w:color="000000"/>
-                <w:top w:val="none" w:sz="0" w:space="0" w:color="000000"/>
-                <w:left w:val="none" w:sz="0" w:space="0" w:color="000000"/>
-                <w:right w:val="none" w:sz="0" w:space="0" w:color="000000"/>
-              </w:pBdr>
-              <w:spacing w:after="40" w:before="40" w:line="240"/>
-              <w:ind w:left="100" w:right="100" w:firstLine="0" w:firstLineChars="0"/>
-              <w:rPr>
-                <w:rFonts w:ascii="Times New Roman" w:hAnsi="Helvetica" w:eastAsia="Helvetica" w:cs="Helvetica"/>
-                <w:i w:val="false"/>
-                <w:b w:val="false"/>
-                <w:u w:val="none"/>
-                <w:strike w:val="false"/>
-                <w:sz w:val="20"/>
-                <w:szCs w:val="20"/>
-                <w:color w:val="000000"/>
-              </w:rPr>
-            </w:pPr>
-          </w:p>
-        </w:tc>
-        <w:tc>
-          <w:tcPr>
-            <w:tcBorders>
-              <w:bottom w:val="single" w:sz="4" w:space="0" w:color="666666"/>
-              <w:top w:val="none" w:sz="0" w:space="0" w:color="000000"/>
-              <w:left w:val="none" w:sz="0" w:space="0" w:color="000000"/>
-              <w:right w:val="none" w:sz="0" w:space="0" w:color="000000"/>
-            </w:tcBorders>
-            <w:shd w:val="clear" w:color="auto" w:fill="FFFFFF"/>
-            <w:tcMar>
-              <w:top w:w="0" w:type="dxa"/>
-              <w:bottom w:w="0" w:type="dxa"/>
-              <w:left w:w="0" w:type="dxa"/>
-              <w:right w:w="0" w:type="dxa"/>
-            </w:tcMar>
-            <w:vAlign w:val="center"/>
-          </w:tcPr>
-          <w:p>
-            <w:pPr>
-              <w:pStyle w:val="Normal"/>
-              <w:jc w:val="left"/>
-              <w:keepNext/>
-              <w:pBdr>
-                <w:bottom w:val="none" w:sz="0" w:space="0" w:color="000000"/>
-                <w:top w:val="none" w:sz="0" w:space="0" w:color="000000"/>
-                <w:left w:val="none" w:sz="0" w:space="0" w:color="000000"/>
-                <w:right w:val="none" w:sz="0" w:space="0" w:color="000000"/>
-              </w:pBdr>
-              <w:spacing w:after="40" w:before="40" w:line="240"/>
-              <w:ind w:left="100" w:right="100" w:firstLine="0" w:firstLineChars="0"/>
-              <w:rPr>
-                <w:rFonts w:ascii="Times New Roman" w:hAnsi="Helvetica" w:eastAsia="Helvetica" w:cs="Helvetica"/>
-                <w:i w:val="false"/>
-                <w:b w:val="false"/>
-                <w:u w:val="none"/>
-                <w:strike w:val="false"/>
-                <w:sz w:val="20"/>
-                <w:szCs w:val="20"/>
-                <w:color w:val="000000"/>
-              </w:rPr>
-            </w:pPr>
-            <w:r>
-              <w:rPr>
-                <w:rFonts w:ascii="Times New Roman" w:hAnsi="Helvetica" w:eastAsia="Helvetica" w:cs="Helvetica"/>
-                <w:i w:val="false"/>
-                <w:b w:val="false"/>
-                <w:u w:val="none"/>
-                <w:strike w:val="false"/>
-                <w:sz w:val="20"/>
-                <w:szCs w:val="20"/>
-                <w:color w:val="000000"/>
-              </w:rPr>
-              <w:t xml:space="preserve">Plant Native Grasses and Forbs</w:t>
-            </w:r>
-          </w:p>
-        </w:tc>
-        <w:tc>
-          <w:tcPr>
-            <w:tcBorders>
-              <w:bottom w:val="single" w:sz="4" w:space="0" w:color="666666"/>
-              <w:top w:val="none" w:sz="0" w:space="0" w:color="000000"/>
-              <w:left w:val="none" w:sz="0" w:space="0" w:color="000000"/>
-              <w:right w:val="none" w:sz="0" w:space="0" w:color="000000"/>
-            </w:tcBorders>
-            <w:shd w:val="clear" w:color="auto" w:fill="FFFFFF"/>
-            <w:tcMar>
-              <w:top w:w="0" w:type="dxa"/>
-              <w:bottom w:w="0" w:type="dxa"/>
-              <w:left w:w="0" w:type="dxa"/>
-              <w:right w:w="0" w:type="dxa"/>
-            </w:tcMar>
-            <w:vAlign w:val="center"/>
-          </w:tcPr>
-          <w:p>
-            <w:pPr>
-              <w:pStyle w:val="Normal"/>
-              <w:jc w:val="center"/>
-              <w:keepNext/>
-              <w:pBdr>
-                <w:bottom w:val="none" w:sz="0" w:space="0" w:color="000000"/>
-                <w:top w:val="none" w:sz="0" w:space="0" w:color="000000"/>
-                <w:left w:val="none" w:sz="0" w:space="0" w:color="000000"/>
-                <w:right w:val="none" w:sz="0" w:space="0" w:color="000000"/>
-              </w:pBdr>
-              <w:spacing w:after="40" w:before="40" w:line="240"/>
-              <w:ind w:left="100" w:right="100" w:firstLine="0" w:firstLineChars="0"/>
-              <w:rPr>
-                <w:rFonts w:ascii="Times New Roman" w:hAnsi="Helvetica" w:eastAsia="Helvetica" w:cs="Helvetica"/>
-                <w:i w:val="false"/>
-                <w:b w:val="false"/>
-                <w:u w:val="none"/>
-                <w:strike w:val="false"/>
-                <w:sz w:val="20"/>
-                <w:szCs w:val="20"/>
-                <w:color w:val="000000"/>
-              </w:rPr>
-            </w:pPr>
-            <w:r>
-              <w:rPr>
-                <w:rFonts w:ascii="Times New Roman" w:hAnsi="Helvetica" w:eastAsia="Helvetica" w:cs="Helvetica"/>
-                <w:i w:val="false"/>
-                <w:b w:val="false"/>
-                <w:u w:val="none"/>
-                <w:strike w:val="false"/>
-                <w:sz w:val="20"/>
-                <w:szCs w:val="20"/>
-                <w:color w:val="000000"/>
-              </w:rPr>
-              <w:t xml:space="preserve">-0.24 (-0.52, 0.05)</w:t>
-            </w:r>
-          </w:p>
-        </w:tc>
-        <w:tc>
-          <w:tcPr>
-            <w:tcBorders>
-              <w:bottom w:val="single" w:sz="4" w:space="0" w:color="666666"/>
-              <w:top w:val="none" w:sz="0" w:space="0" w:color="000000"/>
-              <w:left w:val="none" w:sz="0" w:space="0" w:color="000000"/>
-              <w:right w:val="none" w:sz="0" w:space="0" w:color="000000"/>
-            </w:tcBorders>
-            <w:shd w:val="clear" w:color="auto" w:fill="FFFFFF"/>
-            <w:tcMar>
-              <w:top w:w="0" w:type="dxa"/>
-              <w:bottom w:w="0" w:type="dxa"/>
-              <w:left w:w="0" w:type="dxa"/>
-              <w:right w:w="0" w:type="dxa"/>
-            </w:tcMar>
-            <w:vAlign w:val="center"/>
-          </w:tcPr>
-          <w:p>
-            <w:pPr>
-              <w:pStyle w:val="Normal"/>
-              <w:jc w:val="center"/>
-              <w:keepNext/>
-              <w:pBdr>
-                <w:bottom w:val="none" w:sz="0" w:space="0" w:color="000000"/>
-                <w:top w:val="none" w:sz="0" w:space="0" w:color="000000"/>
-                <w:left w:val="none" w:sz="0" w:space="0" w:color="000000"/>
-                <w:right w:val="none" w:sz="0" w:space="0" w:color="000000"/>
-              </w:pBdr>
-              <w:spacing w:after="40" w:before="40" w:line="240"/>
-              <w:ind w:left="100" w:right="100" w:firstLine="0" w:firstLineChars="0"/>
-              <w:rPr>
-                <w:rFonts w:ascii="Times New Roman" w:hAnsi="Helvetica" w:eastAsia="Helvetica" w:cs="Helvetica"/>
-                <w:i w:val="false"/>
-                <w:b w:val="false"/>
-                <w:u w:val="none"/>
-                <w:strike w:val="false"/>
-                <w:sz w:val="20"/>
-                <w:szCs w:val="20"/>
-                <w:color w:val="000000"/>
-              </w:rPr>
-            </w:pPr>
-            <w:r>
-              <w:rPr>
-                <w:rFonts w:ascii="Times New Roman" w:hAnsi="Helvetica" w:eastAsia="Helvetica" w:cs="Helvetica"/>
-                <w:i w:val="false"/>
-                <w:b w:val="false"/>
-                <w:u w:val="none"/>
-                <w:strike w:val="false"/>
-                <w:sz w:val="20"/>
-                <w:szCs w:val="20"/>
-                <w:color w:val="000000"/>
-              </w:rPr>
-              <w:t xml:space="preserve">0.051</w:t>
             </w:r>
           </w:p>
         </w:tc>
@@ -15788,64 +13442,8 @@
         <w:tc>
           <w:tcPr>
             <w:tcBorders>
-              <w:bottom w:val="single" w:sz="4" w:space="0" w:color="666666"/>
-              <w:top w:val="single" w:sz="4" w:space="0" w:color="666666"/>
-              <w:left w:val="none" w:sz="0" w:space="0" w:color="000000"/>
-              <w:right w:val="none" w:sz="0" w:space="0" w:color="000000"/>
-            </w:tcBorders>
-            <w:shd w:val="clear" w:color="auto" w:fill="FFFFFF"/>
-            <w:tcMar>
-              <w:top w:w="0" w:type="dxa"/>
-              <w:bottom w:w="0" w:type="dxa"/>
-              <w:left w:w="0" w:type="dxa"/>
-              <w:right w:w="0" w:type="dxa"/>
-            </w:tcMar>
-            <w:vAlign w:val="center"/>
-          </w:tcPr>
-          <w:p>
-            <w:pPr>
-              <w:pStyle w:val="Normal"/>
-              <w:jc w:val="center"/>
-              <w:keepNext/>
-              <w:pBdr>
-                <w:bottom w:val="none" w:sz="0" w:space="0" w:color="000000"/>
-                <w:top w:val="none" w:sz="0" w:space="0" w:color="000000"/>
-                <w:left w:val="none" w:sz="0" w:space="0" w:color="000000"/>
-                <w:right w:val="none" w:sz="0" w:space="0" w:color="000000"/>
-              </w:pBdr>
-              <w:spacing w:after="40" w:before="40" w:line="240"/>
-              <w:ind w:left="100" w:right="100" w:firstLine="0" w:firstLineChars="0"/>
-              <w:rPr>
-                <w:rFonts w:ascii="Times New Roman" w:hAnsi="Helvetica" w:eastAsia="Helvetica" w:cs="Helvetica"/>
-                <w:i w:val="false"/>
-                <w:b w:val="false"/>
-                <w:u w:val="none"/>
-                <w:strike w:val="false"/>
-                <w:sz w:val="20"/>
-                <w:szCs w:val="20"/>
-                <w:color w:val="000000"/>
-              </w:rPr>
-            </w:pPr>
-            <w:r>
-              <w:rPr>
-                <w:rFonts w:ascii="Times New Roman" w:hAnsi="Helvetica" w:eastAsia="Helvetica" w:cs="Helvetica"/>
-                <w:i w:val="false"/>
-                <w:b w:val="false"/>
-                <w:u w:val="none"/>
-                <w:strike w:val="false"/>
-                <w:sz w:val="20"/>
-                <w:szCs w:val="20"/>
-                <w:color w:val="000000"/>
-              </w:rPr>
-              <w:t xml:space="preserve">Nest Success</w:t>
-            </w:r>
-          </w:p>
-        </w:tc>
-        <w:tc>
-          <w:tcPr>
-            <w:tcBorders>
-              <w:bottom w:val="single" w:sz="4" w:space="0" w:color="666666"/>
-              <w:top w:val="single" w:sz="4" w:space="0" w:color="666666"/>
+              <w:bottom w:val="single" w:sz="12" w:space="0" w:color="666666"/>
+              <w:top w:val="none" w:sz="0" w:space="0" w:color="000000"/>
               <w:left w:val="none" w:sz="0" w:space="0" w:color="000000"/>
               <w:right w:val="none" w:sz="0" w:space="0" w:color="000000"/>
             </w:tcBorders>
@@ -15893,119 +13491,119 @@
                 <w:szCs w:val="20"/>
                 <w:color w:val="000000"/>
               </w:rPr>
-              <w:t xml:space="preserve">Promote Edge and Shrub Habitat</w:t>
-            </w:r>
-          </w:p>
-        </w:tc>
-        <w:tc>
-          <w:tcPr>
-            <w:tcBorders>
-              <w:bottom w:val="single" w:sz="4" w:space="0" w:color="666666"/>
-              <w:top w:val="single" w:sz="4" w:space="0" w:color="666666"/>
-              <w:left w:val="none" w:sz="0" w:space="0" w:color="000000"/>
-              <w:right w:val="none" w:sz="0" w:space="0" w:color="000000"/>
-            </w:tcBorders>
-            <w:shd w:val="clear" w:color="auto" w:fill="FFFFFF"/>
-            <w:tcMar>
-              <w:top w:w="0" w:type="dxa"/>
-              <w:bottom w:w="0" w:type="dxa"/>
-              <w:left w:w="0" w:type="dxa"/>
-              <w:right w:w="0" w:type="dxa"/>
-            </w:tcMar>
-            <w:vAlign w:val="center"/>
-          </w:tcPr>
-          <w:p>
-            <w:pPr>
-              <w:pStyle w:val="Normal"/>
-              <w:jc w:val="center"/>
-              <w:keepNext/>
-              <w:pBdr>
-                <w:bottom w:val="none" w:sz="0" w:space="0" w:color="000000"/>
-                <w:top w:val="none" w:sz="0" w:space="0" w:color="000000"/>
-                <w:left w:val="none" w:sz="0" w:space="0" w:color="000000"/>
-                <w:right w:val="none" w:sz="0" w:space="0" w:color="000000"/>
-              </w:pBdr>
-              <w:spacing w:after="40" w:before="40" w:line="240"/>
-              <w:ind w:left="100" w:right="100" w:firstLine="0" w:firstLineChars="0"/>
-              <w:rPr>
-                <w:rFonts w:ascii="Times New Roman" w:hAnsi="Helvetica" w:eastAsia="Helvetica" w:cs="Helvetica"/>
-                <w:i w:val="false"/>
-                <w:b w:val="false"/>
-                <w:u w:val="none"/>
-                <w:strike w:val="false"/>
-                <w:sz w:val="20"/>
-                <w:szCs w:val="20"/>
-                <w:color w:val="000000"/>
-              </w:rPr>
-            </w:pPr>
-            <w:r>
-              <w:rPr>
-                <w:rFonts w:ascii="Times New Roman" w:hAnsi="Helvetica" w:eastAsia="Helvetica" w:cs="Helvetica"/>
-                <w:i w:val="false"/>
-                <w:b w:val="false"/>
-                <w:u w:val="none"/>
-                <w:strike w:val="false"/>
-                <w:sz w:val="20"/>
-                <w:szCs w:val="20"/>
-                <w:color w:val="000000"/>
-              </w:rPr>
-              <w:t xml:space="preserve">-0.80 (-1.56, 0.03)</w:t>
-            </w:r>
-          </w:p>
-        </w:tc>
-        <w:tc>
-          <w:tcPr>
-            <w:tcBorders>
-              <w:bottom w:val="single" w:sz="4" w:space="0" w:color="666666"/>
-              <w:top w:val="single" w:sz="4" w:space="0" w:color="666666"/>
-              <w:left w:val="none" w:sz="0" w:space="0" w:color="000000"/>
-              <w:right w:val="none" w:sz="0" w:space="0" w:color="000000"/>
-            </w:tcBorders>
-            <w:shd w:val="clear" w:color="auto" w:fill="FFFFFF"/>
-            <w:tcMar>
-              <w:top w:w="0" w:type="dxa"/>
-              <w:bottom w:w="0" w:type="dxa"/>
-              <w:left w:w="0" w:type="dxa"/>
-              <w:right w:w="0" w:type="dxa"/>
-            </w:tcMar>
-            <w:vAlign w:val="center"/>
-          </w:tcPr>
-          <w:p>
-            <w:pPr>
-              <w:pStyle w:val="Normal"/>
-              <w:jc w:val="center"/>
-              <w:keepNext/>
-              <w:pBdr>
-                <w:bottom w:val="none" w:sz="0" w:space="0" w:color="000000"/>
-                <w:top w:val="none" w:sz="0" w:space="0" w:color="000000"/>
-                <w:left w:val="none" w:sz="0" w:space="0" w:color="000000"/>
-                <w:right w:val="none" w:sz="0" w:space="0" w:color="000000"/>
-              </w:pBdr>
-              <w:spacing w:after="40" w:before="40" w:line="240"/>
-              <w:ind w:left="100" w:right="100" w:firstLine="0" w:firstLineChars="0"/>
-              <w:rPr>
-                <w:rFonts w:ascii="Times New Roman" w:hAnsi="Helvetica" w:eastAsia="Helvetica" w:cs="Helvetica"/>
-                <w:i w:val="false"/>
-                <w:b w:val="false"/>
-                <w:u w:val="none"/>
-                <w:strike w:val="false"/>
-                <w:sz w:val="20"/>
-                <w:szCs w:val="20"/>
-                <w:color w:val="000000"/>
-              </w:rPr>
-            </w:pPr>
-            <w:r>
-              <w:rPr>
-                <w:rFonts w:ascii="Times New Roman" w:hAnsi="Helvetica" w:eastAsia="Helvetica" w:cs="Helvetica"/>
-                <w:i w:val="false"/>
-                <w:b w:val="false"/>
-                <w:u w:val="none"/>
-                <w:strike w:val="false"/>
-                <w:sz w:val="20"/>
-                <w:szCs w:val="20"/>
-                <w:color w:val="000000"/>
-              </w:rPr>
-              <w:t xml:space="preserve">0.029</w:t>
+              <w:t xml:space="preserve">Plant Native Grasses and Forbs</w:t>
+            </w:r>
+          </w:p>
+        </w:tc>
+        <w:tc>
+          <w:tcPr>
+            <w:tcBorders>
+              <w:bottom w:val="single" w:sz="12" w:space="0" w:color="666666"/>
+              <w:top w:val="none" w:sz="0" w:space="0" w:color="000000"/>
+              <w:left w:val="none" w:sz="0" w:space="0" w:color="000000"/>
+              <w:right w:val="none" w:sz="0" w:space="0" w:color="000000"/>
+            </w:tcBorders>
+            <w:shd w:val="clear" w:color="auto" w:fill="FFFFFF"/>
+            <w:tcMar>
+              <w:top w:w="0" w:type="dxa"/>
+              <w:bottom w:w="0" w:type="dxa"/>
+              <w:left w:w="0" w:type="dxa"/>
+              <w:right w:w="0" w:type="dxa"/>
+            </w:tcMar>
+            <w:vAlign w:val="center"/>
+          </w:tcPr>
+          <w:p>
+            <w:pPr>
+              <w:pStyle w:val="Normal"/>
+              <w:jc w:val="center"/>
+              <w:keepNext/>
+              <w:pBdr>
+                <w:bottom w:val="none" w:sz="0" w:space="0" w:color="000000"/>
+                <w:top w:val="none" w:sz="0" w:space="0" w:color="000000"/>
+                <w:left w:val="none" w:sz="0" w:space="0" w:color="000000"/>
+                <w:right w:val="none" w:sz="0" w:space="0" w:color="000000"/>
+              </w:pBdr>
+              <w:spacing w:after="40" w:before="40" w:line="240"/>
+              <w:ind w:left="100" w:right="100" w:firstLine="0" w:firstLineChars="0"/>
+              <w:rPr>
+                <w:rFonts w:ascii="Times New Roman" w:hAnsi="Helvetica" w:eastAsia="Helvetica" w:cs="Helvetica"/>
+                <w:i w:val="false"/>
+                <w:b w:val="false"/>
+                <w:u w:val="none"/>
+                <w:strike w:val="false"/>
+                <w:sz w:val="20"/>
+                <w:szCs w:val="20"/>
+                <w:color w:val="000000"/>
+              </w:rPr>
+            </w:pPr>
+            <w:r>
+              <w:rPr>
+                <w:rFonts w:ascii="Times New Roman" w:hAnsi="Helvetica" w:eastAsia="Helvetica" w:cs="Helvetica"/>
+                <w:i w:val="false"/>
+                <w:b w:val="false"/>
+                <w:u w:val="none"/>
+                <w:strike w:val="false"/>
+                <w:sz w:val="20"/>
+                <w:szCs w:val="20"/>
+                <w:color w:val="000000"/>
+              </w:rPr>
+              <w:t xml:space="preserve">-0.24 (-0.52, 0.05)</w:t>
+            </w:r>
+          </w:p>
+        </w:tc>
+        <w:tc>
+          <w:tcPr>
+            <w:tcBorders>
+              <w:bottom w:val="single" w:sz="12" w:space="0" w:color="666666"/>
+              <w:top w:val="none" w:sz="0" w:space="0" w:color="000000"/>
+              <w:left w:val="none" w:sz="0" w:space="0" w:color="000000"/>
+              <w:right w:val="none" w:sz="0" w:space="0" w:color="000000"/>
+            </w:tcBorders>
+            <w:shd w:val="clear" w:color="auto" w:fill="FFFFFF"/>
+            <w:tcMar>
+              <w:top w:w="0" w:type="dxa"/>
+              <w:bottom w:w="0" w:type="dxa"/>
+              <w:left w:w="0" w:type="dxa"/>
+              <w:right w:w="0" w:type="dxa"/>
+            </w:tcMar>
+            <w:vAlign w:val="center"/>
+          </w:tcPr>
+          <w:p>
+            <w:pPr>
+              <w:pStyle w:val="Normal"/>
+              <w:jc w:val="center"/>
+              <w:keepNext/>
+              <w:pBdr>
+                <w:bottom w:val="none" w:sz="0" w:space="0" w:color="000000"/>
+                <w:top w:val="none" w:sz="0" w:space="0" w:color="000000"/>
+                <w:left w:val="none" w:sz="0" w:space="0" w:color="000000"/>
+                <w:right w:val="none" w:sz="0" w:space="0" w:color="000000"/>
+              </w:pBdr>
+              <w:spacing w:after="40" w:before="40" w:line="240"/>
+              <w:ind w:left="100" w:right="100" w:firstLine="0" w:firstLineChars="0"/>
+              <w:rPr>
+                <w:rFonts w:ascii="Times New Roman" w:hAnsi="Helvetica" w:eastAsia="Helvetica" w:cs="Helvetica"/>
+                <w:i w:val="false"/>
+                <w:b w:val="false"/>
+                <w:u w:val="none"/>
+                <w:strike w:val="false"/>
+                <w:sz w:val="20"/>
+                <w:szCs w:val="20"/>
+                <w:color w:val="000000"/>
+              </w:rPr>
+            </w:pPr>
+            <w:r>
+              <w:rPr>
+                <w:rFonts w:ascii="Times New Roman" w:hAnsi="Helvetica" w:eastAsia="Helvetica" w:cs="Helvetica"/>
+                <w:i w:val="false"/>
+                <w:b w:val="false"/>
+                <w:u w:val="none"/>
+                <w:strike w:val="false"/>
+                <w:sz w:val="20"/>
+                <w:szCs w:val="20"/>
+                <w:color w:val="000000"/>
+              </w:rPr>
+              <w:t xml:space="preserve">0.051</w:t>
             </w:r>
           </w:p>
         </w:tc>

</xml_diff>